<commit_message>
docs: make multiserver task dispatch user-defined
</commit_message>
<xml_diff>
--- a/人形机器人多步可恢复性算法实验评测协议 (1).docx
+++ b/人形机器人多步可恢复性算法实验评测协议 (1).docx
@@ -2476,7 +2476,7 @@
           <w:ilvl w:val="0"/>
           <w:numId w:val="1"/>
         </w:numPr>
-        <w:spacing w:lineRule="auto" w:line="268" w:before="0" w:after="50"/>
+        <w:spacing w:lineRule="auto" w:line="264" w:before="0" w:after="50"/>
         <w:contextualSpacing/>
         <w:rPr/>
       </w:pPr>
@@ -2537,7 +2537,7 @@
           <w:ilvl w:val="0"/>
           <w:numId w:val="1"/>
         </w:numPr>
-        <w:spacing w:lineRule="auto" w:line="268" w:before="0" w:after="50"/>
+        <w:spacing w:lineRule="auto" w:line="264" w:before="0" w:after="50"/>
         <w:contextualSpacing/>
         <w:rPr/>
       </w:pPr>
@@ -2577,7 +2577,7 @@
           <w:ilvl w:val="0"/>
           <w:numId w:val="1"/>
         </w:numPr>
-        <w:spacing w:lineRule="auto" w:line="268" w:before="0" w:after="50"/>
+        <w:spacing w:lineRule="auto" w:line="264" w:before="0" w:after="50"/>
         <w:contextualSpacing/>
         <w:rPr/>
       </w:pPr>
@@ -2596,7 +2596,7 @@
           <w:ilvl w:val="0"/>
           <w:numId w:val="1"/>
         </w:numPr>
-        <w:spacing w:lineRule="auto" w:line="268" w:before="0" w:after="50"/>
+        <w:spacing w:lineRule="auto" w:line="264" w:before="0" w:after="50"/>
         <w:contextualSpacing/>
         <w:rPr/>
       </w:pPr>
@@ -2728,7 +2728,7 @@
           <w:ilvl w:val="0"/>
           <w:numId w:val="1"/>
         </w:numPr>
-        <w:spacing w:lineRule="auto" w:line="268" w:before="0" w:after="50"/>
+        <w:spacing w:lineRule="auto" w:line="264" w:before="0" w:after="50"/>
         <w:contextualSpacing/>
         <w:rPr/>
       </w:pPr>
@@ -2817,7 +2817,7 @@
           <w:ilvl w:val="0"/>
           <w:numId w:val="1"/>
         </w:numPr>
-        <w:spacing w:lineRule="auto" w:line="268" w:before="0" w:after="50"/>
+        <w:spacing w:lineRule="auto" w:line="264" w:before="0" w:after="50"/>
         <w:contextualSpacing/>
         <w:rPr/>
       </w:pPr>
@@ -3745,7 +3745,7 @@
           <w:ilvl w:val="0"/>
           <w:numId w:val="1"/>
         </w:numPr>
-        <w:spacing w:lineRule="auto" w:line="268" w:before="0" w:after="50"/>
+        <w:spacing w:lineRule="auto" w:line="264" w:before="0" w:after="50"/>
         <w:contextualSpacing/>
         <w:rPr/>
       </w:pPr>
@@ -3792,7 +3792,7 @@
           <w:ilvl w:val="0"/>
           <w:numId w:val="1"/>
         </w:numPr>
-        <w:spacing w:lineRule="auto" w:line="268" w:before="0" w:after="50"/>
+        <w:spacing w:lineRule="auto" w:line="264" w:before="0" w:after="50"/>
         <w:contextualSpacing/>
         <w:rPr/>
       </w:pPr>
@@ -3867,7 +3867,7 @@
           <w:ilvl w:val="0"/>
           <w:numId w:val="1"/>
         </w:numPr>
-        <w:spacing w:lineRule="auto" w:line="268" w:before="0" w:after="50"/>
+        <w:spacing w:lineRule="auto" w:line="264" w:before="0" w:after="50"/>
         <w:contextualSpacing/>
         <w:rPr/>
       </w:pPr>
@@ -3907,7 +3907,7 @@
           <w:ilvl w:val="0"/>
           <w:numId w:val="1"/>
         </w:numPr>
-        <w:spacing w:lineRule="auto" w:line="268" w:before="0" w:after="50"/>
+        <w:spacing w:lineRule="auto" w:line="264" w:before="0" w:after="50"/>
         <w:contextualSpacing/>
         <w:rPr/>
       </w:pPr>
@@ -3940,7 +3940,7 @@
           <w:ilvl w:val="0"/>
           <w:numId w:val="1"/>
         </w:numPr>
-        <w:spacing w:lineRule="auto" w:line="268" w:before="0" w:after="50"/>
+        <w:spacing w:lineRule="auto" w:line="264" w:before="0" w:after="50"/>
         <w:contextualSpacing/>
         <w:rPr/>
       </w:pPr>
@@ -4115,7 +4115,7 @@
           <w:ilvl w:val="0"/>
           <w:numId w:val="1"/>
         </w:numPr>
-        <w:spacing w:lineRule="auto" w:line="268" w:before="0" w:after="50"/>
+        <w:spacing w:lineRule="auto" w:line="264" w:before="0" w:after="50"/>
         <w:contextualSpacing/>
         <w:rPr/>
       </w:pPr>
@@ -4155,7 +4155,7 @@
           <w:ilvl w:val="0"/>
           <w:numId w:val="1"/>
         </w:numPr>
-        <w:spacing w:lineRule="auto" w:line="268" w:before="0" w:after="50"/>
+        <w:spacing w:lineRule="auto" w:line="264" w:before="0" w:after="50"/>
         <w:contextualSpacing/>
         <w:rPr/>
       </w:pPr>
@@ -4223,7 +4223,7 @@
           <w:ilvl w:val="0"/>
           <w:numId w:val="1"/>
         </w:numPr>
-        <w:spacing w:lineRule="auto" w:line="268" w:before="0" w:after="50"/>
+        <w:spacing w:lineRule="auto" w:line="264" w:before="0" w:after="50"/>
         <w:contextualSpacing/>
         <w:rPr/>
       </w:pPr>
@@ -4270,7 +4270,7 @@
           <w:ilvl w:val="0"/>
           <w:numId w:val="1"/>
         </w:numPr>
-        <w:spacing w:lineRule="auto" w:line="268" w:before="0" w:after="50"/>
+        <w:spacing w:lineRule="auto" w:line="264" w:before="0" w:after="50"/>
         <w:contextualSpacing/>
         <w:rPr/>
       </w:pPr>
@@ -6670,7 +6670,7 @@
     <w:p>
       <w:pPr>
         <w:pStyle w:val="Normal"/>
-        <w:spacing w:lineRule="auto" w:line="268" w:before="0" w:after="50"/>
+        <w:spacing w:lineRule="auto" w:line="264" w:before="0" w:after="50"/>
         <w:ind w:start="369" w:hanging="283"/>
         <w:rPr/>
       </w:pPr>
@@ -6706,7 +6706,7 @@
     <w:p>
       <w:pPr>
         <w:pStyle w:val="Normal"/>
-        <w:spacing w:lineRule="auto" w:line="268" w:before="0" w:after="50"/>
+        <w:spacing w:lineRule="auto" w:line="264" w:before="0" w:after="50"/>
         <w:ind w:start="369" w:hanging="283"/>
         <w:rPr/>
       </w:pPr>
@@ -6763,7 +6763,7 @@
     <w:p>
       <w:pPr>
         <w:pStyle w:val="Normal"/>
-        <w:spacing w:lineRule="auto" w:line="268" w:before="0" w:after="50"/>
+        <w:spacing w:lineRule="auto" w:line="264" w:before="0" w:after="50"/>
         <w:ind w:start="369" w:hanging="283"/>
         <w:rPr/>
       </w:pPr>
@@ -6813,7 +6813,7 @@
     <w:p>
       <w:pPr>
         <w:pStyle w:val="Normal"/>
-        <w:spacing w:lineRule="auto" w:line="268" w:before="0" w:after="50"/>
+        <w:spacing w:lineRule="auto" w:line="264" w:before="0" w:after="50"/>
         <w:ind w:start="369" w:hanging="283"/>
         <w:rPr/>
       </w:pPr>
@@ -7548,7 +7548,7 @@
           <w:ilvl w:val="0"/>
           <w:numId w:val="1"/>
         </w:numPr>
-        <w:spacing w:lineRule="auto" w:line="268" w:before="0" w:after="50"/>
+        <w:spacing w:lineRule="auto" w:line="264" w:before="0" w:after="50"/>
         <w:contextualSpacing/>
         <w:rPr/>
       </w:pPr>
@@ -7686,7 +7686,7 @@
           <w:ilvl w:val="0"/>
           <w:numId w:val="1"/>
         </w:numPr>
-        <w:spacing w:lineRule="auto" w:line="268" w:before="0" w:after="50"/>
+        <w:spacing w:lineRule="auto" w:line="264" w:before="0" w:after="50"/>
         <w:contextualSpacing/>
         <w:rPr/>
       </w:pPr>
@@ -7775,7 +7775,7 @@
           <w:ilvl w:val="0"/>
           <w:numId w:val="1"/>
         </w:numPr>
-        <w:spacing w:lineRule="auto" w:line="268" w:before="0" w:after="50"/>
+        <w:spacing w:lineRule="auto" w:line="264" w:before="0" w:after="50"/>
         <w:contextualSpacing/>
         <w:rPr/>
       </w:pPr>
@@ -9508,7 +9508,7 @@
     <w:p>
       <w:pPr>
         <w:pStyle w:val="Normal"/>
-        <w:spacing w:lineRule="auto" w:line="268" w:before="0" w:after="50"/>
+        <w:spacing w:lineRule="auto" w:line="264" w:before="0" w:after="50"/>
         <w:ind w:start="369" w:hanging="283"/>
         <w:rPr/>
       </w:pPr>
@@ -9558,7 +9558,7 @@
     <w:p>
       <w:pPr>
         <w:pStyle w:val="Normal"/>
-        <w:spacing w:lineRule="auto" w:line="268" w:before="0" w:after="50"/>
+        <w:spacing w:lineRule="auto" w:line="264" w:before="0" w:after="50"/>
         <w:ind w:start="369" w:hanging="283"/>
         <w:rPr/>
       </w:pPr>
@@ -9594,7 +9594,7 @@
     <w:p>
       <w:pPr>
         <w:pStyle w:val="Normal"/>
-        <w:spacing w:lineRule="auto" w:line="268" w:before="0" w:after="50"/>
+        <w:spacing w:lineRule="auto" w:line="264" w:before="0" w:after="50"/>
         <w:ind w:start="369" w:hanging="283"/>
         <w:rPr/>
       </w:pPr>
@@ -9623,7 +9623,7 @@
     <w:p>
       <w:pPr>
         <w:pStyle w:val="Normal"/>
-        <w:spacing w:lineRule="auto" w:line="268" w:before="0" w:after="50"/>
+        <w:spacing w:lineRule="auto" w:line="264" w:before="0" w:after="50"/>
         <w:ind w:start="369" w:hanging="283"/>
         <w:rPr/>
       </w:pPr>
@@ -9680,7 +9680,7 @@
     <w:p>
       <w:pPr>
         <w:pStyle w:val="Normal"/>
-        <w:spacing w:lineRule="auto" w:line="268" w:before="0" w:after="50"/>
+        <w:spacing w:lineRule="auto" w:line="264" w:before="0" w:after="50"/>
         <w:ind w:start="369" w:hanging="283"/>
         <w:rPr/>
       </w:pPr>
@@ -9981,7 +9981,7 @@
           <w:ilvl w:val="0"/>
           <w:numId w:val="1"/>
         </w:numPr>
-        <w:spacing w:lineRule="auto" w:line="268" w:before="0" w:after="50"/>
+        <w:spacing w:lineRule="auto" w:line="264" w:before="0" w:after="50"/>
         <w:contextualSpacing/>
         <w:rPr/>
       </w:pPr>
@@ -10000,7 +10000,7 @@
           <w:ilvl w:val="0"/>
           <w:numId w:val="1"/>
         </w:numPr>
-        <w:spacing w:lineRule="auto" w:line="268" w:before="0" w:after="50"/>
+        <w:spacing w:lineRule="auto" w:line="264" w:before="0" w:after="50"/>
         <w:contextualSpacing/>
         <w:rPr/>
       </w:pPr>
@@ -10033,7 +10033,7 @@
           <w:ilvl w:val="0"/>
           <w:numId w:val="1"/>
         </w:numPr>
-        <w:spacing w:lineRule="auto" w:line="268" w:before="0" w:after="50"/>
+        <w:spacing w:lineRule="auto" w:line="264" w:before="0" w:after="50"/>
         <w:contextualSpacing/>
         <w:rPr/>
       </w:pPr>
@@ -10052,7 +10052,7 @@
           <w:ilvl w:val="0"/>
           <w:numId w:val="1"/>
         </w:numPr>
-        <w:spacing w:lineRule="auto" w:line="268" w:before="0" w:after="50"/>
+        <w:spacing w:lineRule="auto" w:line="264" w:before="0" w:after="50"/>
         <w:contextualSpacing/>
         <w:rPr/>
       </w:pPr>
@@ -10085,7 +10085,7 @@
           <w:ilvl w:val="0"/>
           <w:numId w:val="1"/>
         </w:numPr>
-        <w:spacing w:lineRule="auto" w:line="268" w:before="0" w:after="50"/>
+        <w:spacing w:lineRule="auto" w:line="264" w:before="0" w:after="50"/>
         <w:contextualSpacing/>
         <w:rPr/>
       </w:pPr>
@@ -11050,7 +11050,7 @@
           <w:ilvl w:val="0"/>
           <w:numId w:val="1"/>
         </w:numPr>
-        <w:spacing w:lineRule="auto" w:line="268" w:before="0" w:after="50"/>
+        <w:spacing w:lineRule="auto" w:line="264" w:before="0" w:after="50"/>
         <w:contextualSpacing/>
         <w:rPr/>
       </w:pPr>
@@ -11083,7 +11083,7 @@
           <w:ilvl w:val="0"/>
           <w:numId w:val="1"/>
         </w:numPr>
-        <w:spacing w:lineRule="auto" w:line="268" w:before="0" w:after="50"/>
+        <w:spacing w:lineRule="auto" w:line="264" w:before="0" w:after="50"/>
         <w:contextualSpacing/>
         <w:rPr/>
       </w:pPr>
@@ -11116,7 +11116,7 @@
           <w:ilvl w:val="0"/>
           <w:numId w:val="1"/>
         </w:numPr>
-        <w:spacing w:lineRule="auto" w:line="268" w:before="0" w:after="50"/>
+        <w:spacing w:lineRule="auto" w:line="264" w:before="0" w:after="50"/>
         <w:contextualSpacing/>
         <w:rPr/>
       </w:pPr>
@@ -11191,7 +11191,7 @@
           <w:ilvl w:val="0"/>
           <w:numId w:val="1"/>
         </w:numPr>
-        <w:spacing w:lineRule="auto" w:line="268" w:before="0" w:after="50"/>
+        <w:spacing w:lineRule="auto" w:line="264" w:before="0" w:after="50"/>
         <w:contextualSpacing/>
         <w:rPr/>
       </w:pPr>
@@ -11259,7 +11259,7 @@
           <w:ilvl w:val="0"/>
           <w:numId w:val="1"/>
         </w:numPr>
-        <w:spacing w:lineRule="auto" w:line="268" w:before="0" w:after="50"/>
+        <w:spacing w:lineRule="auto" w:line="264" w:before="0" w:after="50"/>
         <w:contextualSpacing/>
         <w:rPr/>
       </w:pPr>
@@ -11278,7 +11278,7 @@
           <w:ilvl w:val="0"/>
           <w:numId w:val="1"/>
         </w:numPr>
-        <w:spacing w:lineRule="auto" w:line="268" w:before="0" w:after="50"/>
+        <w:spacing w:lineRule="auto" w:line="264" w:before="0" w:after="50"/>
         <w:contextualSpacing/>
         <w:rPr/>
       </w:pPr>
@@ -11311,7 +11311,7 @@
           <w:ilvl w:val="0"/>
           <w:numId w:val="1"/>
         </w:numPr>
-        <w:spacing w:lineRule="auto" w:line="268" w:before="0" w:after="50"/>
+        <w:spacing w:lineRule="auto" w:line="264" w:before="0" w:after="50"/>
         <w:contextualSpacing/>
         <w:rPr/>
       </w:pPr>
@@ -12689,7 +12689,7 @@
           <w:b/>
           <w:sz w:val="28"/>
         </w:rPr>
-        <w:t>十三二 三服务器任务所有权</w:t>
+        <w:t>十三二 等价服务器与用户自定义任务分配</w:t>
       </w:r>
       <w:r>
         <w:rPr>
@@ -12705,7 +12705,7 @@
           <w:b/>
           <w:sz w:val="28"/>
         </w:rPr>
-        <w:t xml:space="preserve">默认按模型分配服务器，并以完整 </w:t>
+        <w:t>三台服务器按配置与权限等价处理，不设置主服务器，也不规定服务器与模型的固定对应关系。用户可以用自然语言向任意服务器指定要使用的模型、阶段、实验或任意实验组合；协议不设置固定任务范围或命令菜单。</w:t>
       </w:r>
       <w:r>
         <w:rPr>
@@ -12713,7 +12713,7 @@
           <w:b/>
           <w:sz w:val="28"/>
         </w:rPr>
-        <w:t xml:space="preserve">model-experiment shard </w:t>
+        <w:t>A</w:t>
       </w:r>
       <w:r>
         <w:rPr>
@@ -12721,7 +12721,7 @@
           <w:b/>
           <w:sz w:val="28"/>
         </w:rPr>
-        <w:t>为最小执行单元。</w:t>
+        <w:t>、</w:t>
       </w:r>
       <w:r>
         <w:rPr>
@@ -12729,7 +12729,7 @@
           <w:b/>
           <w:sz w:val="28"/>
         </w:rPr>
-        <w:t xml:space="preserve">shard </w:t>
+        <w:t>B</w:t>
       </w:r>
       <w:r>
         <w:rPr>
@@ -12737,7 +12737,7 @@
           <w:b/>
           <w:sz w:val="28"/>
         </w:rPr>
-        <w:t xml:space="preserve">唯一键为 </w:t>
+        <w:t>、</w:t>
       </w:r>
       <w:r>
         <w:rPr>
@@ -12745,7 +12745,7 @@
           <w:b/>
           <w:sz w:val="28"/>
         </w:rPr>
-        <w:t>protocol_hash</w:t>
+        <w:t xml:space="preserve">C </w:t>
       </w:r>
       <w:r>
         <w:rPr>
@@ -12753,7 +12753,7 @@
           <w:b/>
           <w:sz w:val="28"/>
         </w:rPr>
-        <w:t>、</w:t>
+        <w:t xml:space="preserve">任意一台均可运行任意已注册并冻结的模型。同一个模型也可以在多台服务器上运行，只要它们负责不同的 </w:t>
       </w:r>
       <w:r>
         <w:rPr>
@@ -12761,7 +12761,7 @@
           <w:b/>
           <w:sz w:val="28"/>
         </w:rPr>
-        <w:t>stage</w:t>
+        <w:t xml:space="preserve">stage </w:t>
       </w:r>
       <w:r>
         <w:rPr>
@@ -12769,7 +12769,7 @@
           <w:b/>
           <w:sz w:val="28"/>
         </w:rPr>
-        <w:t>、</w:t>
+        <w:t xml:space="preserve">或 </w:t>
       </w:r>
       <w:r>
         <w:rPr>
@@ -12777,7 +12777,7 @@
           <w:b/>
           <w:sz w:val="28"/>
         </w:rPr>
-        <w:t>experiment_id</w:t>
+        <w:t>experiment shard</w:t>
       </w:r>
       <w:r>
         <w:rPr>
@@ -12785,7 +12785,7 @@
           <w:b/>
           <w:sz w:val="28"/>
         </w:rPr>
-        <w:t>、</w:t>
+        <w:t xml:space="preserve">。不同服务器可以使用同一份模型无关 </w:t>
       </w:r>
       <w:r>
         <w:rPr>
@@ -12793,7 +12793,7 @@
           <w:b/>
           <w:sz w:val="28"/>
         </w:rPr>
-        <w:t>model_id</w:t>
+        <w:t xml:space="preserve">manifest </w:t>
       </w:r>
       <w:r>
         <w:rPr>
@@ -12801,7 +12801,7 @@
           <w:b/>
           <w:sz w:val="28"/>
         </w:rPr>
-        <w:t>、</w:t>
+        <w:t xml:space="preserve">和配对 </w:t>
       </w:r>
       <w:r>
         <w:rPr>
@@ -12809,7 +12809,7 @@
           <w:b/>
           <w:sz w:val="28"/>
         </w:rPr>
-        <w:t xml:space="preserve">single training run id </w:t>
+        <w:t xml:space="preserve">eval_seed </w:t>
       </w:r>
       <w:r>
         <w:rPr>
@@ -12817,7 +12817,7 @@
           <w:b/>
           <w:sz w:val="28"/>
         </w:rPr>
-        <w:t xml:space="preserve">和 </w:t>
+        <w:t xml:space="preserve">分别评测相同或不同模型。以完整 </w:t>
       </w:r>
       <w:r>
         <w:rPr>
@@ -12825,7 +12825,7 @@
           <w:b/>
           <w:sz w:val="28"/>
         </w:rPr>
-        <w:t>manifest_hash</w:t>
+        <w:t xml:space="preserve">model-experiment shard </w:t>
       </w:r>
       <w:r>
         <w:rPr>
@@ -12833,7 +12833,7 @@
           <w:b/>
           <w:sz w:val="28"/>
         </w:rPr>
-        <w:t xml:space="preserve">。一个 </w:t>
+        <w:t xml:space="preserve">为最小执行单元，其唯一键为 </w:t>
       </w:r>
       <w:r>
         <w:rPr>
@@ -12841,7 +12841,7 @@
           <w:b/>
           <w:sz w:val="28"/>
         </w:rPr>
-        <w:t xml:space="preserve">model-experiment shard </w:t>
+        <w:t>protocol_hash</w:t>
       </w:r>
       <w:r>
         <w:rPr>
@@ -12849,7 +12849,7 @@
           <w:b/>
           <w:sz w:val="28"/>
         </w:rPr>
-        <w:t xml:space="preserve">在任一时刻只允许一台服务器写入，禁止三台服务器同时运行同一 </w:t>
+        <w:t>、</w:t>
       </w:r>
       <w:r>
         <w:rPr>
@@ -12857,7 +12857,7 @@
           <w:b/>
           <w:sz w:val="28"/>
         </w:rPr>
-        <w:t>shard</w:t>
+        <w:t>stage</w:t>
       </w:r>
       <w:r>
         <w:rPr>
@@ -12865,7 +12865,7 @@
           <w:b/>
           <w:sz w:val="28"/>
         </w:rPr>
-        <w:t xml:space="preserve">。当前三机分工固定为：服务器 </w:t>
+        <w:t>、</w:t>
       </w:r>
       <w:r>
         <w:rPr>
@@ -12873,7 +12873,7 @@
           <w:b/>
           <w:sz w:val="28"/>
         </w:rPr>
-        <w:t xml:space="preserve">A </w:t>
+        <w:t>experiment_id</w:t>
       </w:r>
       <w:r>
         <w:rPr>
@@ -12881,7 +12881,7 @@
           <w:b/>
           <w:sz w:val="28"/>
         </w:rPr>
-        <w:t xml:space="preserve">负责 </w:t>
+        <w:t>、</w:t>
       </w:r>
       <w:r>
         <w:rPr>
@@ -12889,7 +12889,7 @@
           <w:b/>
           <w:sz w:val="28"/>
         </w:rPr>
-        <w:t>M1 Baseline</w:t>
+        <w:t>model_id</w:t>
       </w:r>
       <w:r>
         <w:rPr>
@@ -12897,7 +12897,7 @@
           <w:b/>
           <w:sz w:val="28"/>
         </w:rPr>
-        <w:t xml:space="preserve">，并独占断点续跑正式实验一 </w:t>
+        <w:t>、</w:t>
       </w:r>
       <w:r>
         <w:rPr>
@@ -12905,7 +12905,7 @@
           <w:b/>
           <w:sz w:val="28"/>
         </w:rPr>
-        <w:t>M1</w:t>
+        <w:t xml:space="preserve">single training run id </w:t>
       </w:r>
       <w:r>
         <w:rPr>
@@ -12913,7 +12913,7 @@
           <w:b/>
           <w:sz w:val="28"/>
         </w:rPr>
-        <w:t xml:space="preserve">；服务器 </w:t>
+        <w:t xml:space="preserve">和 </w:t>
       </w:r>
       <w:r>
         <w:rPr>
@@ -12921,7 +12921,7 @@
           <w:b/>
           <w:sz w:val="28"/>
         </w:rPr>
-        <w:t xml:space="preserve">B </w:t>
+        <w:t>manifest_hash</w:t>
       </w:r>
       <w:r>
         <w:rPr>
@@ -12929,7 +12929,7 @@
           <w:b/>
           <w:sz w:val="28"/>
         </w:rPr>
-        <w:t xml:space="preserve">负责 </w:t>
+        <w:t xml:space="preserve">。同一个 </w:t>
       </w:r>
       <w:r>
         <w:rPr>
@@ -12937,7 +12937,7 @@
           <w:b/>
           <w:sz w:val="28"/>
         </w:rPr>
-        <w:t>M2 DWAQ</w:t>
+        <w:t xml:space="preserve">shard </w:t>
       </w:r>
       <w:r>
         <w:rPr>
@@ -12945,7 +12945,7 @@
           <w:b/>
           <w:sz w:val="28"/>
         </w:rPr>
-        <w:t xml:space="preserve">；服务器 </w:t>
+        <w:t xml:space="preserve">在任一时刻只允许一台服务器写入，禁止两台服务器同时运行同一模型的同一实验。若以后必须跨服务器拆分同一 </w:t>
       </w:r>
       <w:r>
         <w:rPr>
@@ -12953,7 +12953,7 @@
           <w:b/>
           <w:sz w:val="28"/>
         </w:rPr>
-        <w:t xml:space="preserve">C </w:t>
+        <w:t>model-experiment shard</w:t>
       </w:r>
       <w:r>
         <w:rPr>
@@ -12961,7 +12961,7 @@
           <w:b/>
           <w:sz w:val="28"/>
         </w:rPr>
-        <w:t xml:space="preserve">负责 </w:t>
+        <w:t xml:space="preserve">，必须先生成冻结的全局分片 </w:t>
       </w:r>
       <w:r>
         <w:rPr>
@@ -12969,7 +12969,7 @@
           <w:b/>
           <w:sz w:val="28"/>
         </w:rPr>
-        <w:t>M5 Ours</w:t>
+        <w:t>manifest</w:t>
       </w:r>
       <w:r>
         <w:rPr>
@@ -12977,7 +12977,7 @@
           <w:b/>
           <w:sz w:val="28"/>
         </w:rPr>
-        <w:t xml:space="preserve">。服务器 </w:t>
+        <w:t xml:space="preserve">，并按 </w:t>
       </w:r>
       <w:r>
         <w:rPr>
@@ -12985,7 +12985,7 @@
           <w:b/>
           <w:sz w:val="28"/>
         </w:rPr>
-        <w:t>A</w:t>
+        <w:t xml:space="preserve">global_sequence </w:t>
       </w:r>
       <w:r>
         <w:rPr>
@@ -12993,7 +12993,7 @@
           <w:b/>
           <w:sz w:val="28"/>
         </w:rPr>
-        <w:t>、</w:t>
+        <w:t xml:space="preserve">对服务器数取模分配 </w:t>
       </w:r>
       <w:r>
         <w:rPr>
@@ -13001,7 +13001,7 @@
           <w:b/>
           <w:sz w:val="28"/>
         </w:rPr>
-        <w:t>B</w:t>
+        <w:t>shard_index</w:t>
       </w:r>
       <w:r>
         <w:rPr>
@@ -13009,7 +13009,7 @@
           <w:b/>
           <w:sz w:val="28"/>
         </w:rPr>
-        <w:t>、</w:t>
+        <w:t>；在该功能通过自动测试和冻结前不得自行拆分。</w:t>
       </w:r>
       <w:r>
         <w:rPr>
@@ -13017,7 +13017,7 @@
           <w:b/>
           <w:sz w:val="28"/>
         </w:rPr>
-        <w:t xml:space="preserve">C </w:t>
+        <w:br/>
       </w:r>
       <w:r>
         <w:rPr>
@@ -13025,7 +13025,7 @@
           <w:b/>
           <w:sz w:val="28"/>
         </w:rPr>
-        <w:t xml:space="preserve">分别为自己负责的模型运行实验二和实验三，但必须使用同一份模型无关 </w:t>
+        <w:t xml:space="preserve">截至 </w:t>
       </w:r>
       <w:r>
         <w:rPr>
@@ -13033,7 +13033,7 @@
           <w:b/>
           <w:sz w:val="28"/>
         </w:rPr>
-        <w:t xml:space="preserve">manifest </w:t>
+        <w:t>2026-09-13</w:t>
       </w:r>
       <w:r>
         <w:rPr>
@@ -13041,7 +13041,7 @@
           <w:b/>
           <w:sz w:val="28"/>
         </w:rPr>
-        <w:t xml:space="preserve">和配对 </w:t>
+        <w:t xml:space="preserve">，正式实验一 </w:t>
       </w:r>
       <w:r>
         <w:rPr>
@@ -13049,7 +13049,7 @@
           <w:b/>
           <w:sz w:val="28"/>
         </w:rPr>
-        <w:t>eval_seed</w:t>
+        <w:t xml:space="preserve">M1 </w:t>
       </w:r>
       <w:r>
         <w:rPr>
@@ -13057,7 +13057,7 @@
           <w:b/>
           <w:sz w:val="28"/>
         </w:rPr>
-        <w:t>。</w:t>
+        <w:t xml:space="preserve">已逐批原子落盘 </w:t>
       </w:r>
       <w:r>
         <w:rPr>
@@ -13065,7 +13065,7 @@
           <w:b/>
           <w:sz w:val="28"/>
         </w:rPr>
-        <w:t xml:space="preserve">M3 </w:t>
+        <w:t xml:space="preserve">global_sequence 0 </w:t>
       </w:r>
       <w:r>
         <w:rPr>
@@ -13073,7 +13073,7 @@
           <w:b/>
           <w:sz w:val="28"/>
         </w:rPr>
-        <w:t xml:space="preserve">与 </w:t>
+        <w:t xml:space="preserve">至 </w:t>
       </w:r>
       <w:r>
         <w:rPr>
@@ -13081,7 +13081,7 @@
           <w:b/>
           <w:sz w:val="28"/>
         </w:rPr>
-        <w:t xml:space="preserve">M4 </w:t>
+        <w:t>18383</w:t>
       </w:r>
       <w:r>
         <w:rPr>
@@ -13089,7 +13089,7 @@
           <w:b/>
           <w:sz w:val="28"/>
         </w:rPr>
-        <w:t xml:space="preserve">在 </w:t>
+        <w:t xml:space="preserve">，共 </w:t>
       </w:r>
       <w:r>
         <w:rPr>
@@ -13097,7 +13097,7 @@
           <w:b/>
           <w:sz w:val="28"/>
         </w:rPr>
-        <w:t xml:space="preserve">checkpoint </w:t>
+        <w:t xml:space="preserve">18384 </w:t>
       </w:r>
       <w:r>
         <w:rPr>
@@ -13105,7 +13105,7 @@
           <w:b/>
           <w:sz w:val="28"/>
         </w:rPr>
-        <w:t xml:space="preserve">注册并冻结后，再作为独立模型 </w:t>
+        <w:t xml:space="preserve">条候选记录；等样本分析集为 </w:t>
       </w:r>
       <w:r>
         <w:rPr>
@@ -13113,7 +13113,7 @@
           <w:b/>
           <w:sz w:val="28"/>
         </w:rPr>
-        <w:t xml:space="preserve">shard </w:t>
+        <w:t>882/1440</w:t>
       </w:r>
       <w:r>
         <w:rPr>
@@ -13121,7 +13121,7 @@
           <w:b/>
           <w:sz w:val="28"/>
         </w:rPr>
-        <w:t xml:space="preserve">指派给唯一服务器，不得与现有模型目录混写。模型内各 </w:t>
+        <w:t xml:space="preserve">，该 </w:t>
       </w:r>
       <w:r>
         <w:rPr>
@@ -13129,7 +13129,7 @@
           <w:b/>
           <w:sz w:val="28"/>
         </w:rPr>
-        <w:t xml:space="preserve">trial </w:t>
+        <w:t xml:space="preserve">shard </w:t>
       </w:r>
       <w:r>
         <w:rPr>
@@ -13137,7 +13137,7 @@
           <w:b/>
           <w:sz w:val="28"/>
         </w:rPr>
-        <w:t>仍可在单机使用</w:t>
+        <w:t xml:space="preserve">当前暂停但尚未完成。该 </w:t>
       </w:r>
       <w:r>
         <w:rPr>
@@ -13145,7 +13145,7 @@
           <w:b/>
           <w:sz w:val="28"/>
         </w:rPr>
-        <w:t xml:space="preserve">2048 </w:t>
+        <w:t xml:space="preserve">shard </w:t>
       </w:r>
       <w:r>
         <w:rPr>
@@ -13153,7 +13153,7 @@
           <w:b/>
           <w:sz w:val="28"/>
         </w:rPr>
-        <w:t xml:space="preserve">个并行环境。若以后必须跨服务器拆分同一 </w:t>
+        <w:t xml:space="preserve">可以在三台服务器中的任意一台继续，由用户选择；运行前必须把完整目录交给唯一执行服务器并完成校验，不得由多台服务器从相同 </w:t>
       </w:r>
       <w:r>
         <w:rPr>
@@ -13161,7 +13161,7 @@
           <w:b/>
           <w:sz w:val="28"/>
         </w:rPr>
-        <w:t>model-experiment shard</w:t>
+        <w:t xml:space="preserve">trial_id </w:t>
       </w:r>
       <w:r>
         <w:rPr>
@@ -13169,263 +13169,7 @@
           <w:b/>
           <w:sz w:val="28"/>
         </w:rPr>
-        <w:t xml:space="preserve">，必须先生成冻结的全局分片 </w:t>
-      </w:r>
-      <w:r>
-        <w:rPr>
-          <w:rFonts w:eastAsia="Hiragino Sans GB" w:ascii="Arial" w:hAnsi="Arial"/>
-          <w:b/>
-          <w:sz w:val="28"/>
-        </w:rPr>
-        <w:t>manifest</w:t>
-      </w:r>
-      <w:r>
-        <w:rPr>
-          <w:rFonts w:ascii="Arial" w:hAnsi="Arial" w:eastAsia="Hiragino Sans GB"/>
-          <w:b/>
-          <w:sz w:val="28"/>
-        </w:rPr>
-        <w:t>，并按</w:t>
-      </w:r>
-      <w:r>
-        <w:rPr>
-          <w:rFonts w:eastAsia="Hiragino Sans GB" w:ascii="Arial" w:hAnsi="Arial"/>
-          <w:b/>
-          <w:sz w:val="28"/>
-        </w:rPr>
-        <w:t xml:space="preserve">global_sequence </w:t>
-      </w:r>
-      <w:r>
-        <w:rPr>
-          <w:rFonts w:ascii="Arial" w:hAnsi="Arial" w:eastAsia="Hiragino Sans GB"/>
-          <w:b/>
-          <w:sz w:val="28"/>
-        </w:rPr>
-        <w:t xml:space="preserve">对 </w:t>
-      </w:r>
-      <w:r>
-        <w:rPr>
-          <w:rFonts w:eastAsia="Hiragino Sans GB" w:ascii="Arial" w:hAnsi="Arial"/>
-          <w:b/>
-          <w:sz w:val="28"/>
-        </w:rPr>
-        <w:t xml:space="preserve">3 </w:t>
-      </w:r>
-      <w:r>
-        <w:rPr>
-          <w:rFonts w:ascii="Arial" w:hAnsi="Arial" w:eastAsia="Hiragino Sans GB"/>
-          <w:b/>
-          <w:sz w:val="28"/>
-        </w:rPr>
-        <w:t xml:space="preserve">取模分配 </w:t>
-      </w:r>
-      <w:r>
-        <w:rPr>
-          <w:rFonts w:eastAsia="Hiragino Sans GB" w:ascii="Arial" w:hAnsi="Arial"/>
-          <w:b/>
-          <w:sz w:val="28"/>
-        </w:rPr>
-        <w:t>shard_index</w:t>
-      </w:r>
-      <w:r>
-        <w:rPr>
-          <w:rFonts w:ascii="Arial" w:hAnsi="Arial" w:eastAsia="Hiragino Sans GB"/>
-          <w:b/>
-          <w:sz w:val="28"/>
-        </w:rPr>
-        <w:t>；在该功能通过自动测试和冻结前不得自行拆分。</w:t>
-      </w:r>
-      <w:r>
-        <w:rPr>
-          <w:rFonts w:eastAsia="Hiragino Sans GB" w:ascii="Arial" w:hAnsi="Arial"/>
-          <w:b/>
-          <w:sz w:val="28"/>
-        </w:rPr>
-        <w:br/>
-      </w:r>
-      <w:r>
-        <w:rPr>
-          <w:rFonts w:ascii="Arial" w:hAnsi="Arial" w:eastAsia="Hiragino Sans GB"/>
-          <w:b/>
-          <w:sz w:val="28"/>
-        </w:rPr>
-        <w:t xml:space="preserve">截至 </w:t>
-      </w:r>
-      <w:r>
-        <w:rPr>
-          <w:rFonts w:eastAsia="Hiragino Sans GB" w:ascii="Arial" w:hAnsi="Arial"/>
-          <w:b/>
-          <w:sz w:val="28"/>
-        </w:rPr>
-        <w:t>2026-09-13</w:t>
-      </w:r>
-      <w:r>
-        <w:rPr>
-          <w:rFonts w:ascii="Arial" w:hAnsi="Arial" w:eastAsia="Hiragino Sans GB"/>
-          <w:b/>
-          <w:sz w:val="28"/>
-        </w:rPr>
-        <w:t xml:space="preserve">，正式实验一 </w:t>
-      </w:r>
-      <w:r>
-        <w:rPr>
-          <w:rFonts w:eastAsia="Hiragino Sans GB" w:ascii="Arial" w:hAnsi="Arial"/>
-          <w:b/>
-          <w:sz w:val="28"/>
-        </w:rPr>
-        <w:t xml:space="preserve">M1 </w:t>
-      </w:r>
-      <w:r>
-        <w:rPr>
-          <w:rFonts w:ascii="Arial" w:hAnsi="Arial" w:eastAsia="Hiragino Sans GB"/>
-          <w:b/>
-          <w:sz w:val="28"/>
-        </w:rPr>
-        <w:t xml:space="preserve">已在服务器 </w:t>
-      </w:r>
-      <w:r>
-        <w:rPr>
-          <w:rFonts w:eastAsia="Hiragino Sans GB" w:ascii="Arial" w:hAnsi="Arial"/>
-          <w:b/>
-          <w:sz w:val="28"/>
-        </w:rPr>
-        <w:t xml:space="preserve">A </w:t>
-      </w:r>
-      <w:r>
-        <w:rPr>
-          <w:rFonts w:ascii="Arial" w:hAnsi="Arial" w:eastAsia="Hiragino Sans GB"/>
-          <w:b/>
-          <w:sz w:val="28"/>
-        </w:rPr>
-        <w:t xml:space="preserve">完成并逐批原子落盘 </w:t>
-      </w:r>
-      <w:r>
-        <w:rPr>
-          <w:rFonts w:eastAsia="Hiragino Sans GB" w:ascii="Arial" w:hAnsi="Arial"/>
-          <w:b/>
-          <w:sz w:val="28"/>
-        </w:rPr>
-        <w:t xml:space="preserve">global_sequence 0 </w:t>
-      </w:r>
-      <w:r>
-        <w:rPr>
-          <w:rFonts w:ascii="Arial" w:hAnsi="Arial" w:eastAsia="Hiragino Sans GB"/>
-          <w:b/>
-          <w:sz w:val="28"/>
-        </w:rPr>
-        <w:t xml:space="preserve">至 </w:t>
-      </w:r>
-      <w:r>
-        <w:rPr>
-          <w:rFonts w:eastAsia="Hiragino Sans GB" w:ascii="Arial" w:hAnsi="Arial"/>
-          <w:b/>
-          <w:sz w:val="28"/>
-        </w:rPr>
-        <w:t>18383</w:t>
-      </w:r>
-      <w:r>
-        <w:rPr>
-          <w:rFonts w:ascii="Arial" w:hAnsi="Arial" w:eastAsia="Hiragino Sans GB"/>
-          <w:b/>
-          <w:sz w:val="28"/>
-        </w:rPr>
-        <w:t xml:space="preserve">，共 </w:t>
-      </w:r>
-      <w:r>
-        <w:rPr>
-          <w:rFonts w:eastAsia="Hiragino Sans GB" w:ascii="Arial" w:hAnsi="Arial"/>
-          <w:b/>
-          <w:sz w:val="28"/>
-        </w:rPr>
-        <w:t xml:space="preserve">18384 </w:t>
-      </w:r>
-      <w:r>
-        <w:rPr>
-          <w:rFonts w:ascii="Arial" w:hAnsi="Arial" w:eastAsia="Hiragino Sans GB"/>
-          <w:b/>
-          <w:sz w:val="28"/>
-        </w:rPr>
-        <w:t xml:space="preserve">条候选记录；等样本分析集为 </w:t>
-      </w:r>
-      <w:r>
-        <w:rPr>
-          <w:rFonts w:eastAsia="Hiragino Sans GB" w:ascii="Arial" w:hAnsi="Arial"/>
-          <w:b/>
-          <w:sz w:val="28"/>
-        </w:rPr>
-        <w:t>882/1440</w:t>
-      </w:r>
-      <w:r>
-        <w:rPr>
-          <w:rFonts w:ascii="Arial" w:hAnsi="Arial" w:eastAsia="Hiragino Sans GB"/>
-          <w:b/>
-          <w:sz w:val="28"/>
-        </w:rPr>
-        <w:t xml:space="preserve">，该 </w:t>
-      </w:r>
-      <w:r>
-        <w:rPr>
-          <w:rFonts w:eastAsia="Hiragino Sans GB" w:ascii="Arial" w:hAnsi="Arial"/>
-          <w:b/>
-          <w:sz w:val="28"/>
-        </w:rPr>
-        <w:t xml:space="preserve">shard </w:t>
-      </w:r>
-      <w:r>
-        <w:rPr>
-          <w:rFonts w:ascii="Arial" w:hAnsi="Arial" w:eastAsia="Hiragino Sans GB"/>
-          <w:b/>
-          <w:sz w:val="28"/>
-        </w:rPr>
-        <w:t xml:space="preserve">当前暂停但尚未完成。该 </w:t>
-      </w:r>
-      <w:r>
-        <w:rPr>
-          <w:rFonts w:eastAsia="Hiragino Sans GB" w:ascii="Arial" w:hAnsi="Arial"/>
-          <w:b/>
-          <w:sz w:val="28"/>
-        </w:rPr>
-        <w:t xml:space="preserve">shard </w:t>
-      </w:r>
-      <w:r>
-        <w:rPr>
-          <w:rFonts w:ascii="Arial" w:hAnsi="Arial" w:eastAsia="Hiragino Sans GB"/>
-          <w:b/>
-          <w:sz w:val="28"/>
-        </w:rPr>
-        <w:t xml:space="preserve">只能在服务器 </w:t>
-      </w:r>
-      <w:r>
-        <w:rPr>
-          <w:rFonts w:eastAsia="Hiragino Sans GB" w:ascii="Arial" w:hAnsi="Arial"/>
-          <w:b/>
-          <w:sz w:val="28"/>
-        </w:rPr>
-        <w:t xml:space="preserve">A </w:t>
-      </w:r>
-      <w:r>
-        <w:rPr>
-          <w:rFonts w:ascii="Arial" w:hAnsi="Arial" w:eastAsia="Hiragino Sans GB"/>
-          <w:b/>
-          <w:sz w:val="28"/>
-        </w:rPr>
-        <w:t xml:space="preserve">或完整复制后由唯一接管服务器从断点继续；不得由其他服务器从相同 </w:t>
-      </w:r>
-      <w:r>
-        <w:rPr>
-          <w:rFonts w:eastAsia="Hiragino Sans GB" w:ascii="Arial" w:hAnsi="Arial"/>
-          <w:b/>
-          <w:sz w:val="28"/>
-        </w:rPr>
-        <w:t>trial_id</w:t>
-      </w:r>
-      <w:r>
-        <w:rPr>
-          <w:rFonts w:ascii="Arial" w:hAnsi="Arial" w:eastAsia="Hiragino Sans GB"/>
-          <w:b/>
-          <w:sz w:val="28"/>
-        </w:rPr>
-        <w:t>重新开始。接管前必须比较文件数量、</w:t>
+        <w:t>并行重新开始。接管前必须比较文件数量、</w:t>
       </w:r>
       <w:r>
         <w:rPr>
@@ -14395,6 +14139,7 @@
         </w:tabs>
         <w:ind w:start="1080" w:hanging="360"/>
       </w:pPr>
+      <w:rPr/>
     </w:lvl>
     <w:lvl w:ilvl="2">
       <w:start w:val="1"/>
@@ -14407,6 +14152,7 @@
         </w:tabs>
         <w:ind w:start="1440" w:hanging="360"/>
       </w:pPr>
+      <w:rPr/>
     </w:lvl>
     <w:lvl w:ilvl="3">
       <w:start w:val="1"/>
@@ -14419,6 +14165,7 @@
         </w:tabs>
         <w:ind w:start="1800" w:hanging="360"/>
       </w:pPr>
+      <w:rPr/>
     </w:lvl>
     <w:lvl w:ilvl="4">
       <w:start w:val="1"/>
@@ -14431,6 +14178,7 @@
         </w:tabs>
         <w:ind w:start="2160" w:hanging="360"/>
       </w:pPr>
+      <w:rPr/>
     </w:lvl>
     <w:lvl w:ilvl="5">
       <w:start w:val="1"/>
@@ -14443,6 +14191,7 @@
         </w:tabs>
         <w:ind w:start="2520" w:hanging="360"/>
       </w:pPr>
+      <w:rPr/>
     </w:lvl>
     <w:lvl w:ilvl="6">
       <w:start w:val="1"/>
@@ -14455,6 +14204,7 @@
         </w:tabs>
         <w:ind w:start="2880" w:hanging="360"/>
       </w:pPr>
+      <w:rPr/>
     </w:lvl>
     <w:lvl w:ilvl="7">
       <w:start w:val="1"/>
@@ -14467,6 +14217,7 @@
         </w:tabs>
         <w:ind w:start="3240" w:hanging="360"/>
       </w:pPr>
+      <w:rPr/>
     </w:lvl>
     <w:lvl w:ilvl="8">
       <w:start w:val="1"/>
@@ -14479,6 +14230,7 @@
         </w:tabs>
         <w:ind w:start="3600" w:hanging="360"/>
       </w:pPr>
+      <w:rPr/>
     </w:lvl>
   </w:abstractNum>
   <w:abstractNum w:abstractNumId="2">
@@ -14508,6 +14260,7 @@
         </w:tabs>
         <w:ind w:start="1080" w:hanging="360"/>
       </w:pPr>
+      <w:rPr/>
     </w:lvl>
     <w:lvl w:ilvl="2">
       <w:start w:val="1"/>
@@ -14520,6 +14273,7 @@
         </w:tabs>
         <w:ind w:start="1440" w:hanging="360"/>
       </w:pPr>
+      <w:rPr/>
     </w:lvl>
     <w:lvl w:ilvl="3">
       <w:start w:val="1"/>
@@ -14532,6 +14286,7 @@
         </w:tabs>
         <w:ind w:start="1800" w:hanging="360"/>
       </w:pPr>
+      <w:rPr/>
     </w:lvl>
     <w:lvl w:ilvl="4">
       <w:start w:val="1"/>
@@ -14544,6 +14299,7 @@
         </w:tabs>
         <w:ind w:start="2160" w:hanging="360"/>
       </w:pPr>
+      <w:rPr/>
     </w:lvl>
     <w:lvl w:ilvl="5">
       <w:start w:val="1"/>
@@ -14556,6 +14312,7 @@
         </w:tabs>
         <w:ind w:start="2520" w:hanging="360"/>
       </w:pPr>
+      <w:rPr/>
     </w:lvl>
     <w:lvl w:ilvl="6">
       <w:start w:val="1"/>
@@ -14568,6 +14325,7 @@
         </w:tabs>
         <w:ind w:start="2880" w:hanging="360"/>
       </w:pPr>
+      <w:rPr/>
     </w:lvl>
     <w:lvl w:ilvl="7">
       <w:start w:val="1"/>
@@ -14580,6 +14338,7 @@
         </w:tabs>
         <w:ind w:start="3240" w:hanging="360"/>
       </w:pPr>
+      <w:rPr/>
     </w:lvl>
     <w:lvl w:ilvl="8">
       <w:start w:val="1"/>
@@ -14592,6 +14351,7 @@
         </w:tabs>
         <w:ind w:start="3600" w:hanging="360"/>
       </w:pPr>
+      <w:rPr/>
     </w:lvl>
   </w:abstractNum>
   <w:abstractNum w:abstractNumId="3">
@@ -14621,6 +14381,7 @@
         </w:tabs>
         <w:ind w:start="1080" w:hanging="360"/>
       </w:pPr>
+      <w:rPr/>
     </w:lvl>
     <w:lvl w:ilvl="2">
       <w:start w:val="1"/>
@@ -14633,6 +14394,7 @@
         </w:tabs>
         <w:ind w:start="1440" w:hanging="360"/>
       </w:pPr>
+      <w:rPr/>
     </w:lvl>
     <w:lvl w:ilvl="3">
       <w:start w:val="1"/>
@@ -14645,6 +14407,7 @@
         </w:tabs>
         <w:ind w:start="1800" w:hanging="360"/>
       </w:pPr>
+      <w:rPr/>
     </w:lvl>
     <w:lvl w:ilvl="4">
       <w:start w:val="1"/>
@@ -14657,6 +14420,7 @@
         </w:tabs>
         <w:ind w:start="2160" w:hanging="360"/>
       </w:pPr>
+      <w:rPr/>
     </w:lvl>
     <w:lvl w:ilvl="5">
       <w:start w:val="1"/>
@@ -14669,6 +14433,7 @@
         </w:tabs>
         <w:ind w:start="2520" w:hanging="360"/>
       </w:pPr>
+      <w:rPr/>
     </w:lvl>
     <w:lvl w:ilvl="6">
       <w:start w:val="1"/>
@@ -14681,6 +14446,7 @@
         </w:tabs>
         <w:ind w:start="2880" w:hanging="360"/>
       </w:pPr>
+      <w:rPr/>
     </w:lvl>
     <w:lvl w:ilvl="7">
       <w:start w:val="1"/>
@@ -14693,6 +14459,7 @@
         </w:tabs>
         <w:ind w:start="3240" w:hanging="360"/>
       </w:pPr>
+      <w:rPr/>
     </w:lvl>
     <w:lvl w:ilvl="8">
       <w:start w:val="1"/>
@@ -14705,6 +14472,7 @@
         </w:tabs>
         <w:ind w:start="3600" w:hanging="360"/>
       </w:pPr>
+      <w:rPr/>
     </w:lvl>
   </w:abstractNum>
   <w:abstractNum w:abstractNumId="4">
@@ -14732,6 +14500,7 @@
         </w:tabs>
         <w:ind w:start="1080" w:hanging="360"/>
       </w:pPr>
+      <w:rPr/>
     </w:lvl>
     <w:lvl w:ilvl="2">
       <w:start w:val="1"/>
@@ -14744,6 +14513,7 @@
         </w:tabs>
         <w:ind w:start="1440" w:hanging="360"/>
       </w:pPr>
+      <w:rPr/>
     </w:lvl>
     <w:lvl w:ilvl="3">
       <w:start w:val="1"/>
@@ -14756,6 +14526,7 @@
         </w:tabs>
         <w:ind w:start="1800" w:hanging="360"/>
       </w:pPr>
+      <w:rPr/>
     </w:lvl>
     <w:lvl w:ilvl="4">
       <w:start w:val="1"/>
@@ -14768,6 +14539,7 @@
         </w:tabs>
         <w:ind w:start="2160" w:hanging="360"/>
       </w:pPr>
+      <w:rPr/>
     </w:lvl>
     <w:lvl w:ilvl="5">
       <w:start w:val="1"/>
@@ -14780,6 +14552,7 @@
         </w:tabs>
         <w:ind w:start="2520" w:hanging="360"/>
       </w:pPr>
+      <w:rPr/>
     </w:lvl>
     <w:lvl w:ilvl="6">
       <w:start w:val="1"/>
@@ -14792,6 +14565,7 @@
         </w:tabs>
         <w:ind w:start="2880" w:hanging="360"/>
       </w:pPr>
+      <w:rPr/>
     </w:lvl>
     <w:lvl w:ilvl="7">
       <w:start w:val="1"/>
@@ -14804,6 +14578,7 @@
         </w:tabs>
         <w:ind w:start="3240" w:hanging="360"/>
       </w:pPr>
+      <w:rPr/>
     </w:lvl>
     <w:lvl w:ilvl="8">
       <w:start w:val="1"/>
@@ -14816,6 +14591,7 @@
         </w:tabs>
         <w:ind w:start="3600" w:hanging="360"/>
       </w:pPr>
+      <w:rPr/>
     </w:lvl>
   </w:abstractNum>
   <w:abstractNum w:abstractNumId="5">
@@ -14843,6 +14619,7 @@
         </w:tabs>
         <w:ind w:start="1080" w:hanging="360"/>
       </w:pPr>
+      <w:rPr/>
     </w:lvl>
     <w:lvl w:ilvl="2">
       <w:start w:val="1"/>
@@ -14855,6 +14632,7 @@
         </w:tabs>
         <w:ind w:start="1440" w:hanging="360"/>
       </w:pPr>
+      <w:rPr/>
     </w:lvl>
     <w:lvl w:ilvl="3">
       <w:start w:val="1"/>
@@ -14867,6 +14645,7 @@
         </w:tabs>
         <w:ind w:start="1800" w:hanging="360"/>
       </w:pPr>
+      <w:rPr/>
     </w:lvl>
     <w:lvl w:ilvl="4">
       <w:start w:val="1"/>
@@ -14879,6 +14658,7 @@
         </w:tabs>
         <w:ind w:start="2160" w:hanging="360"/>
       </w:pPr>
+      <w:rPr/>
     </w:lvl>
     <w:lvl w:ilvl="5">
       <w:start w:val="1"/>
@@ -14891,6 +14671,7 @@
         </w:tabs>
         <w:ind w:start="2520" w:hanging="360"/>
       </w:pPr>
+      <w:rPr/>
     </w:lvl>
     <w:lvl w:ilvl="6">
       <w:start w:val="1"/>
@@ -14903,6 +14684,7 @@
         </w:tabs>
         <w:ind w:start="2880" w:hanging="360"/>
       </w:pPr>
+      <w:rPr/>
     </w:lvl>
     <w:lvl w:ilvl="7">
       <w:start w:val="1"/>
@@ -14915,6 +14697,7 @@
         </w:tabs>
         <w:ind w:start="3240" w:hanging="360"/>
       </w:pPr>
+      <w:rPr/>
     </w:lvl>
     <w:lvl w:ilvl="8">
       <w:start w:val="1"/>
@@ -14927,6 +14710,7 @@
         </w:tabs>
         <w:ind w:start="3600" w:hanging="360"/>
       </w:pPr>
+      <w:rPr/>
     </w:lvl>
   </w:abstractNum>
   <w:abstractNum w:abstractNumId="6">
@@ -14954,6 +14738,7 @@
         </w:tabs>
         <w:ind w:start="1080" w:hanging="360"/>
       </w:pPr>
+      <w:rPr/>
     </w:lvl>
     <w:lvl w:ilvl="2">
       <w:start w:val="1"/>
@@ -14966,6 +14751,7 @@
         </w:tabs>
         <w:ind w:start="1440" w:hanging="360"/>
       </w:pPr>
+      <w:rPr/>
     </w:lvl>
     <w:lvl w:ilvl="3">
       <w:start w:val="1"/>
@@ -14978,6 +14764,7 @@
         </w:tabs>
         <w:ind w:start="1800" w:hanging="360"/>
       </w:pPr>
+      <w:rPr/>
     </w:lvl>
     <w:lvl w:ilvl="4">
       <w:start w:val="1"/>
@@ -14990,6 +14777,7 @@
         </w:tabs>
         <w:ind w:start="2160" w:hanging="360"/>
       </w:pPr>
+      <w:rPr/>
     </w:lvl>
     <w:lvl w:ilvl="5">
       <w:start w:val="1"/>
@@ -15002,6 +14790,7 @@
         </w:tabs>
         <w:ind w:start="2520" w:hanging="360"/>
       </w:pPr>
+      <w:rPr/>
     </w:lvl>
     <w:lvl w:ilvl="6">
       <w:start w:val="1"/>
@@ -15014,6 +14803,7 @@
         </w:tabs>
         <w:ind w:start="2880" w:hanging="360"/>
       </w:pPr>
+      <w:rPr/>
     </w:lvl>
     <w:lvl w:ilvl="7">
       <w:start w:val="1"/>
@@ -15026,6 +14816,7 @@
         </w:tabs>
         <w:ind w:start="3240" w:hanging="360"/>
       </w:pPr>
+      <w:rPr/>
     </w:lvl>
     <w:lvl w:ilvl="8">
       <w:start w:val="1"/>
@@ -15038,6 +14829,7 @@
         </w:tabs>
         <w:ind w:start="3600" w:hanging="360"/>
       </w:pPr>
+      <w:rPr/>
     </w:lvl>
   </w:abstractNum>
   <w:abstractNum w:abstractNumId="7">
@@ -15345,6 +15137,7 @@
     <w:rsid w:val="00fc693f"/>
     <w:pPr>
       <w:widowControl/>
+      <w:suppressAutoHyphens w:val="true"/>
       <w:bidi w:val="0"/>
       <w:spacing w:lineRule="auto" w:line="276" w:before="0" w:after="80"/>
       <w:jc w:val="start"/>
@@ -16037,6 +15830,7 @@
     <w:rsid w:val="00fc693f"/>
     <w:pPr>
       <w:widowControl/>
+      <w:suppressAutoHyphens w:val="true"/>
       <w:bidi w:val="0"/>
       <w:spacing w:lineRule="auto" w:line="240" w:before="0" w:after="0"/>
       <w:jc w:val="start"/>
@@ -16133,24 +15927,29 @@
       <w:szCs w:val="16"/>
     </w:rPr>
   </w:style>
-  <w:style w:type="paragraph" w:styleId="List2">
+  <w:style w:type="paragraph" w:styleId="ListBullet3">
     <w:name w:val="List Bullet 3"/>
     <w:basedOn w:val="Normal"/>
     <w:uiPriority w:val="99"/>
     <w:unhideWhenUsed/>
+    <w:qFormat/>
     <w:rsid w:val="00326f90"/>
     <w:pPr>
+      <w:numPr>
+        <w:ilvl w:val="0"/>
+        <w:numId w:val="3"/>
+      </w:numPr>
       <w:spacing w:before="0" w:after="80"/>
-      <w:ind w:start="720" w:hanging="360"/>
       <w:contextualSpacing/>
     </w:pPr>
     <w:rPr/>
   </w:style>
-  <w:style w:type="paragraph" w:styleId="List3">
+  <w:style w:type="paragraph" w:styleId="ListBullet4">
     <w:name w:val="List Bullet 4"/>
     <w:basedOn w:val="Normal"/>
     <w:uiPriority w:val="99"/>
     <w:unhideWhenUsed/>
+    <w:qFormat/>
     <w:rsid w:val="00326f90"/>
     <w:pPr>
       <w:spacing w:before="0" w:after="80"/>
@@ -16187,23 +15986,6 @@
       <w:numPr>
         <w:ilvl w:val="0"/>
         <w:numId w:val="2"/>
-      </w:numPr>
-      <w:spacing w:before="0" w:after="80"/>
-      <w:contextualSpacing/>
-    </w:pPr>
-    <w:rPr/>
-  </w:style>
-  <w:style w:type="paragraph" w:styleId="ListBullet3">
-    <w:name w:val="List Bullet 3"/>
-    <w:basedOn w:val="Normal"/>
-    <w:uiPriority w:val="99"/>
-    <w:unhideWhenUsed/>
-    <w:qFormat/>
-    <w:rsid w:val="00326f90"/>
-    <w:pPr>
-      <w:numPr>
-        <w:ilvl w:val="0"/>
-        <w:numId w:val="3"/>
       </w:numPr>
       <w:spacing w:before="0" w:after="80"/>
       <w:contextualSpacing/>
@@ -16322,6 +16104,7 @@
         <w:tab w:val="left" w:pos="3456" w:leader="none"/>
         <w:tab w:val="left" w:pos="4032" w:leader="none"/>
       </w:tabs>
+      <w:suppressAutoHyphens w:val="true"/>
       <w:bidi w:val="0"/>
       <w:spacing w:lineRule="auto" w:line="276" w:before="0" w:after="200"/>
       <w:jc w:val="start"/>

</xml_diff>

<commit_message>
eval: allow per-task checkpoint selection
</commit_message>
<xml_diff>
--- a/人形机器人多步可恢复性算法实验评测协议 (1).docx
+++ b/人形机器人多步可恢复性算法实验评测协议 (1).docx
@@ -1,6 +1,6 @@
 
 <file path=word/document.xml><?xml version="1.0" encoding="utf-8"?>
-<w:document xmlns:o="urn:schemas-microsoft-com:office:office" xmlns:r="http://schemas.openxmlformats.org/officeDocument/2006/relationships" xmlns:v="urn:schemas-microsoft-com:vml" xmlns:w="http://schemas.openxmlformats.org/wordprocessingml/2006/main" xmlns:w10="urn:schemas-microsoft-com:office:word" xmlns:wp="http://schemas.openxmlformats.org/drawingml/2006/wordprocessingDrawing" xmlns:wps="http://schemas.microsoft.com/office/word/2010/wordprocessingShape" xmlns:wpg="http://schemas.microsoft.com/office/word/2010/wordprocessingGroup" xmlns:mc="http://schemas.openxmlformats.org/markup-compatibility/2006" xmlns:wp14="http://schemas.microsoft.com/office/word/2010/wordprocessingDrawing" xmlns:w14="http://schemas.microsoft.com/office/word/2010/wordml" xmlns:w15="http://schemas.microsoft.com/office/word/2012/wordml" mc:Ignorable="w14 wp14 w15">
+<w:document xmlns:ns1="http://schemas.openxmlformats.org/markup-compatibility/2006" xmlns:ns2="http://schemas.openxmlformats.org/officeDocument/2006/relationships" xmlns:w="http://schemas.openxmlformats.org/wordprocessingml/2006/main" ns1:Ignorable="w14 wp14 w15">
   <w:body>
     <w:p>
       <w:pPr>
@@ -548,63 +548,63 @@
           <w:rFonts w:ascii="Arial" w:hAnsi="Arial"/>
           <w:sz w:val="21"/>
         </w:rPr>
-        <w:t xml:space="preserve">仿真比较五个模型。每种方法只使用一个已经训练完成并预先冻结的 </w:t>
-      </w:r>
-      <w:r>
-        <w:rPr>
-          <w:rFonts w:eastAsia="Hiragino Sans GB"/>
-          <w:sz w:val="21"/>
-        </w:rPr>
-        <w:t>checkpoint</w:t>
-      </w:r>
-      <w:r>
-        <w:rPr>
-          <w:rFonts w:ascii="Arial" w:hAnsi="Arial"/>
-          <w:sz w:val="21"/>
-        </w:rPr>
-        <w:t xml:space="preserve">，不进行多训练种子重复；评测时采用配对的独立 </w:t>
-      </w:r>
-      <w:r>
-        <w:rPr>
-          <w:rFonts w:eastAsia="Hiragino Sans GB"/>
-          <w:sz w:val="21"/>
-        </w:rPr>
-        <w:t>eval seed</w:t>
-      </w:r>
-      <w:r>
-        <w:rPr>
-          <w:rFonts w:ascii="Arial" w:hAnsi="Arial"/>
-          <w:sz w:val="21"/>
-        </w:rPr>
-        <w:t>、环境条件和扰动计划。</w:t>
-      </w:r>
-      <w:r>
-        <w:rPr>
-          <w:rFonts w:eastAsia="Hiragino Sans GB"/>
-          <w:sz w:val="21"/>
-        </w:rPr>
-        <w:t xml:space="preserve">checkpoint </w:t>
-      </w:r>
-      <w:r>
-        <w:rPr>
-          <w:rFonts w:ascii="Arial" w:hAnsi="Arial"/>
-          <w:sz w:val="21"/>
-        </w:rPr>
-        <w:t xml:space="preserve">必须在查看正式评测结果前冻结。本文置信区间反映固定 </w:t>
-      </w:r>
-      <w:r>
-        <w:rPr>
-          <w:rFonts w:eastAsia="Hiragino Sans GB"/>
-          <w:sz w:val="21"/>
-        </w:rPr>
-        <w:t xml:space="preserve">checkpoint </w:t>
-      </w:r>
-      <w:r>
-        <w:rPr>
-          <w:rFonts w:ascii="Arial" w:hAnsi="Arial"/>
-          <w:sz w:val="21"/>
-        </w:rPr>
-        <w:t>下的评测条件变异，不代表训练随机性。</w:t>
+        <w:t xml:space="preserve">仿真比较五种模型结构。Checkpoint 由用户在每次评测任务中选择，运行器按文件实际字节计算 SHA-256，并把不同 checkpoint 或 estimator 保存为独立结果变体。模型注册表中的 checkpoint 仅为默认值，不是全局白名单。不同变体使用配对的独立 eval seed、环境条件和扰动计划；未经明确统计方案不得把不同 checkpoint 合并为同一结果，也不得把评测 seed 的波动解释为训练随机性。</w:t>
+      </w:r>
+      <w:r>
+        <w:rPr>
+          <w:rFonts w:eastAsia="Hiragino Sans GB"/>
+          <w:sz w:val="21"/>
+        </w:rPr>
+        <w:t/>
+      </w:r>
+      <w:r>
+        <w:rPr>
+          <w:rFonts w:ascii="Arial" w:hAnsi="Arial"/>
+          <w:sz w:val="21"/>
+        </w:rPr>
+        <w:t xml:space="preserve"/>
+      </w:r>
+      <w:r>
+        <w:rPr>
+          <w:rFonts w:eastAsia="Hiragino Sans GB"/>
+          <w:sz w:val="21"/>
+        </w:rPr>
+        <w:t/>
+      </w:r>
+      <w:r>
+        <w:rPr>
+          <w:rFonts w:ascii="Arial" w:hAnsi="Arial"/>
+          <w:sz w:val="21"/>
+        </w:rPr>
+        <w:t/>
+      </w:r>
+      <w:r>
+        <w:rPr>
+          <w:rFonts w:eastAsia="Hiragino Sans GB"/>
+          <w:sz w:val="21"/>
+        </w:rPr>
+        <w:t xml:space="preserve"/>
+      </w:r>
+      <w:r>
+        <w:rPr>
+          <w:rFonts w:ascii="Arial" w:hAnsi="Arial"/>
+          <w:sz w:val="21"/>
+        </w:rPr>
+        <w:t xml:space="preserve"/>
+      </w:r>
+      <w:r>
+        <w:rPr>
+          <w:rFonts w:eastAsia="Hiragino Sans GB"/>
+          <w:sz w:val="21"/>
+        </w:rPr>
+        <w:t xml:space="preserve"/>
+      </w:r>
+      <w:r>
+        <w:rPr>
+          <w:rFonts w:ascii="Arial" w:hAnsi="Arial"/>
+          <w:sz w:val="21"/>
+        </w:rPr>
+        <w:t/>
       </w:r>
     </w:p>
     <w:tbl>
@@ -7939,91 +7939,91 @@
           <w:rFonts w:ascii="Arial" w:hAnsi="Arial"/>
           <w:sz w:val="21"/>
         </w:rPr>
-        <w:t xml:space="preserve">五个模型均在无外部扰动条件下评测，每个模型使用一个冻结 </w:t>
-      </w:r>
-      <w:r>
-        <w:rPr>
-          <w:rFonts w:eastAsia="Hiragino Sans GB"/>
-          <w:sz w:val="21"/>
-        </w:rPr>
-        <w:t>checkpoint</w:t>
-      </w:r>
-      <w:r>
-        <w:rPr>
-          <w:rFonts w:ascii="Arial" w:hAnsi="Arial"/>
-          <w:sz w:val="21"/>
-        </w:rPr>
-        <w:t xml:space="preserve">。每条试验运行 </w:t>
-      </w:r>
-      <w:r>
-        <w:rPr>
-          <w:rFonts w:eastAsia="Hiragino Sans GB"/>
-          <w:sz w:val="21"/>
-        </w:rPr>
-        <w:t>12 s</w:t>
-      </w:r>
-      <w:r>
-        <w:rPr>
-          <w:rFonts w:ascii="Arial" w:hAnsi="Arial"/>
-          <w:sz w:val="21"/>
-        </w:rPr>
-        <w:t xml:space="preserve">。每个模型、每个速度区间使用 </w:t>
-      </w:r>
-      <w:r>
-        <w:rPr>
-          <w:rFonts w:eastAsia="Hiragino Sans GB"/>
-          <w:sz w:val="21"/>
-        </w:rPr>
-        <w:t xml:space="preserve">1000 </w:t>
-      </w:r>
-      <w:r>
-        <w:rPr>
-          <w:rFonts w:ascii="Arial" w:hAnsi="Arial"/>
-          <w:sz w:val="21"/>
-        </w:rPr>
-        <w:t xml:space="preserve">个评测环境，在五个坡度上各 </w:t>
-      </w:r>
-      <w:r>
-        <w:rPr>
-          <w:rFonts w:eastAsia="Hiragino Sans GB"/>
-          <w:sz w:val="21"/>
-        </w:rPr>
-        <w:t xml:space="preserve">200 </w:t>
-      </w:r>
-      <w:r>
-        <w:rPr>
-          <w:rFonts w:ascii="Arial" w:hAnsi="Arial"/>
-          <w:sz w:val="21"/>
-        </w:rPr>
-        <w:t xml:space="preserve">条，因此每个模型共 </w:t>
-      </w:r>
-      <w:r>
-        <w:rPr>
-          <w:rFonts w:eastAsia="Hiragino Sans GB"/>
-          <w:sz w:val="21"/>
-        </w:rPr>
-        <w:t xml:space="preserve">2000 </w:t>
-      </w:r>
-      <w:r>
-        <w:rPr>
-          <w:rFonts w:ascii="Arial" w:hAnsi="Arial"/>
-          <w:sz w:val="21"/>
-        </w:rPr>
-        <w:t xml:space="preserve">条。五个模型的固定预算总量为 </w:t>
-      </w:r>
-      <w:r>
-        <w:rPr>
-          <w:rFonts w:eastAsia="Hiragino Sans GB"/>
-          <w:sz w:val="21"/>
-        </w:rPr>
-        <w:t xml:space="preserve">10000 </w:t>
-      </w:r>
-      <w:r>
-        <w:rPr>
-          <w:rFonts w:ascii="Arial" w:hAnsi="Arial"/>
-          <w:sz w:val="21"/>
-        </w:rPr>
-        <w:t>条。</w:t>
+        <w:t xml:space="preserve">五个模型均在无外部扰动条件下评测。每个模型-checkpoint 变体单独执行和汇总，每条试验运行 12 s。每个变体、每个速度区间使用 1000 个评测环境，在五个坡度上各 200 条，因此每个变体共 2000 条。</w:t>
+      </w:r>
+      <w:r>
+        <w:rPr>
+          <w:rFonts w:eastAsia="Hiragino Sans GB"/>
+          <w:sz w:val="21"/>
+        </w:rPr>
+        <w:t/>
+      </w:r>
+      <w:r>
+        <w:rPr>
+          <w:rFonts w:ascii="Arial" w:hAnsi="Arial"/>
+          <w:sz w:val="21"/>
+        </w:rPr>
+        <w:t xml:space="preserve"/>
+      </w:r>
+      <w:r>
+        <w:rPr>
+          <w:rFonts w:eastAsia="Hiragino Sans GB"/>
+          <w:sz w:val="21"/>
+        </w:rPr>
+        <w:t/>
+      </w:r>
+      <w:r>
+        <w:rPr>
+          <w:rFonts w:ascii="Arial" w:hAnsi="Arial"/>
+          <w:sz w:val="21"/>
+        </w:rPr>
+        <w:t xml:space="preserve"/>
+      </w:r>
+      <w:r>
+        <w:rPr>
+          <w:rFonts w:eastAsia="Hiragino Sans GB"/>
+          <w:sz w:val="21"/>
+        </w:rPr>
+        <w:t xml:space="preserve"/>
+      </w:r>
+      <w:r>
+        <w:rPr>
+          <w:rFonts w:ascii="Arial" w:hAnsi="Arial"/>
+          <w:sz w:val="21"/>
+        </w:rPr>
+        <w:t xml:space="preserve"/>
+      </w:r>
+      <w:r>
+        <w:rPr>
+          <w:rFonts w:eastAsia="Hiragino Sans GB"/>
+          <w:sz w:val="21"/>
+        </w:rPr>
+        <w:t xml:space="preserve"/>
+      </w:r>
+      <w:r>
+        <w:rPr>
+          <w:rFonts w:ascii="Arial" w:hAnsi="Arial"/>
+          <w:sz w:val="21"/>
+        </w:rPr>
+        <w:t xml:space="preserve"/>
+      </w:r>
+      <w:r>
+        <w:rPr>
+          <w:rFonts w:eastAsia="Hiragino Sans GB"/>
+          <w:sz w:val="21"/>
+        </w:rPr>
+        <w:t xml:space="preserve"/>
+      </w:r>
+      <w:r>
+        <w:rPr>
+          <w:rFonts w:ascii="Arial" w:hAnsi="Arial"/>
+          <w:sz w:val="21"/>
+        </w:rPr>
+        <w:t xml:space="preserve"/>
+      </w:r>
+      <w:r>
+        <w:rPr>
+          <w:rFonts w:eastAsia="Hiragino Sans GB"/>
+          <w:sz w:val="21"/>
+        </w:rPr>
+        <w:t xml:space="preserve"/>
+      </w:r>
+      <w:r>
+        <w:rPr>
+          <w:rFonts w:ascii="Arial" w:hAnsi="Arial"/>
+          <w:sz w:val="21"/>
+        </w:rPr>
+        <w:t/>
       </w:r>
     </w:p>
     <w:tbl>
@@ -8352,63 +8352,63 @@
           <w:rFonts w:ascii="Arial" w:hAnsi="Arial"/>
           <w:sz w:val="21"/>
         </w:rPr>
-        <w:t xml:space="preserve">论文主表按模型、坡度和速度区间报告该冻结 </w:t>
-      </w:r>
-      <w:r>
-        <w:rPr>
-          <w:rFonts w:eastAsia="Hiragino Sans GB"/>
-          <w:sz w:val="21"/>
-        </w:rPr>
-        <w:t xml:space="preserve">checkpoint </w:t>
-      </w:r>
-      <w:r>
-        <w:rPr>
-          <w:rFonts w:ascii="Arial" w:hAnsi="Arial"/>
-          <w:sz w:val="21"/>
-        </w:rPr>
-        <w:t>的结果。</w:t>
-      </w:r>
-      <w:r>
-        <w:rPr>
-          <w:rFonts w:eastAsia="Hiragino Sans GB"/>
-          <w:sz w:val="21"/>
-        </w:rPr>
-        <w:t xml:space="preserve">RMSE </w:t>
-      </w:r>
-      <w:r>
-        <w:rPr>
-          <w:rFonts w:ascii="Arial" w:hAnsi="Arial"/>
-          <w:sz w:val="21"/>
-        </w:rPr>
-        <w:t xml:space="preserve">与生存率必须成对出现。五种方法使用相同 </w:t>
-      </w:r>
-      <w:r>
-        <w:rPr>
-          <w:rFonts w:eastAsia="Hiragino Sans GB"/>
-          <w:sz w:val="21"/>
-        </w:rPr>
-        <w:t xml:space="preserve">eval seed </w:t>
-      </w:r>
-      <w:r>
-        <w:rPr>
-          <w:rFonts w:ascii="Arial" w:hAnsi="Arial"/>
-          <w:sz w:val="21"/>
-        </w:rPr>
-        <w:t xml:space="preserve">和环境计划；不得把评测 </w:t>
-      </w:r>
-      <w:r>
-        <w:rPr>
-          <w:rFonts w:eastAsia="Hiragino Sans GB"/>
-          <w:sz w:val="21"/>
-        </w:rPr>
-        <w:t xml:space="preserve">seed </w:t>
-      </w:r>
-      <w:r>
-        <w:rPr>
-          <w:rFonts w:ascii="Arial" w:hAnsi="Arial"/>
-          <w:sz w:val="21"/>
-        </w:rPr>
-        <w:t>之间的波动表述为训练种子稳定性。</w:t>
+        <w:t xml:space="preserve">论文主表按模型、checkpoint SHA、坡度和速度区间报告结果。RMSE 与生存率必须成对出现。各变体使用相同 eval seed 和环境计划；不得把评测 seed 之间的波动表述为训练种子稳定性。</w:t>
+      </w:r>
+      <w:r>
+        <w:rPr>
+          <w:rFonts w:eastAsia="Hiragino Sans GB"/>
+          <w:sz w:val="21"/>
+        </w:rPr>
+        <w:t xml:space="preserve"/>
+      </w:r>
+      <w:r>
+        <w:rPr>
+          <w:rFonts w:ascii="Arial" w:hAnsi="Arial"/>
+          <w:sz w:val="21"/>
+        </w:rPr>
+        <w:t/>
+      </w:r>
+      <w:r>
+        <w:rPr>
+          <w:rFonts w:eastAsia="Hiragino Sans GB"/>
+          <w:sz w:val="21"/>
+        </w:rPr>
+        <w:t xml:space="preserve"/>
+      </w:r>
+      <w:r>
+        <w:rPr>
+          <w:rFonts w:ascii="Arial" w:hAnsi="Arial"/>
+          <w:sz w:val="21"/>
+        </w:rPr>
+        <w:t xml:space="preserve"/>
+      </w:r>
+      <w:r>
+        <w:rPr>
+          <w:rFonts w:eastAsia="Hiragino Sans GB"/>
+          <w:sz w:val="21"/>
+        </w:rPr>
+        <w:t xml:space="preserve"/>
+      </w:r>
+      <w:r>
+        <w:rPr>
+          <w:rFonts w:ascii="Arial" w:hAnsi="Arial"/>
+          <w:sz w:val="21"/>
+        </w:rPr>
+        <w:t xml:space="preserve"/>
+      </w:r>
+      <w:r>
+        <w:rPr>
+          <w:rFonts w:eastAsia="Hiragino Sans GB"/>
+          <w:sz w:val="21"/>
+        </w:rPr>
+        <w:t xml:space="preserve"/>
+      </w:r>
+      <w:r>
+        <w:rPr>
+          <w:rFonts w:ascii="Arial" w:hAnsi="Arial"/>
+          <w:sz w:val="21"/>
+        </w:rPr>
+        <w:t/>
       </w:r>
     </w:p>
     <w:p>
@@ -11487,21 +11487,21 @@
                 <w:rFonts w:ascii="Arial" w:hAnsi="Arial"/>
                 <w:sz w:val="18"/>
               </w:rPr>
-              <w:t xml:space="preserve">五种方法各一个训练完成的 </w:t>
+              <w:t xml:space="preserve">每条正式结果必须记录实际 checkpoint 与可选 estimator 的标识及 SHA-256；不设置每个模型只能使用一个 checkpoint 的全局限制</w:t>
             </w:r>
             <w:r>
               <w:rPr>
                 <w:rFonts w:eastAsia="Hiragino Sans GB"/>
                 <w:sz w:val="18"/>
               </w:rPr>
-              <w:t>checkpoint</w:t>
+              <w:t/>
             </w:r>
             <w:r>
               <w:rPr>
                 <w:rFonts w:ascii="Arial" w:hAnsi="Arial"/>
                 <w:sz w:val="18"/>
               </w:rPr>
-              <w:t>，检查点标识与哈希已固定</w:t>
+              <w:t/>
             </w:r>
           </w:p>
         </w:tc>
@@ -11936,7 +11936,7 @@
           <w:b/>
           <w:sz w:val="28"/>
         </w:rPr>
-        <w:t>十三 多服务器执行、</w:t>
+        <w:t xml:space="preserve">十三 多服务器执行、seed 与数据合并实施补充。本节规定计算任务的物理分配与数据汇总。三台服务器配置与权限等价，不设置主服务器，也不规定服务器与模型或 checkpoint 的固定对应关系。用户可以用自然语言向任意服务器指定模型、checkpoint、阶段、实验或任意实验组合。Checkpoint 是任务输入，不是全局冻结项；注册表只提供默认 checkpoint。运行器必须计算 checkpoint 和 estimator 的实际 SHA-256，不同哈希写入独立 shard。Shard 唯一键为 protocol_hash、stage、experiment_id、model_id、train_seed、checkpoint_sha256、estimator_sha256 和 manifest_hash，同一 shard 同时只允许一台服务器写入。screening、pilot、formal 的 seed namespace 分别为 1301000、1302000、1303000；eval_seed = seed_namespace(stage) + experiment_id × 1000000 + global_sequence。服务器编号、主机名和 GPU 编号不得参与 seed。不同模型及 checkpoint 在同一 global_sequence 使用相同 manifest 和 eval_seed 以支持配对比较。跨服务器兼容性由 protocol_version、stage、experiment_id、manifest_hash、metrics_config_hash、physics_profile_hash、evaluation_code_hash、asset_hash 和 simulator_version 判断，Git HEAD 仅记录来源，文档提交不同但可执行代码哈希相同时允许合并。聚合时以 model_id、checkpoint_sha256、estimator_sha256、train_seed 和 trial_id 去重，不同 checkpoint 不默认合并。已有正式实验一 M1 shard 已完成 18384 条候选、分析集 882/1440；它必须继续使用 paper-eval-v1.3-frozen 及原代码哈希续跑，不能由多台服务器同时写入。</w:t>
       </w:r>
       <w:r>
         <w:rPr>
@@ -11944,7 +11944,7 @@
           <w:b/>
           <w:sz w:val="28"/>
         </w:rPr>
-        <w:t xml:space="preserve">seed </w:t>
+        <w:t xml:space="preserve"/>
       </w:r>
       <w:r>
         <w:rPr>
@@ -11952,7 +11952,7 @@
           <w:b/>
           <w:sz w:val="28"/>
         </w:rPr>
-        <w:t>与数据合并实施补充</w:t>
+        <w:t/>
       </w:r>
       <w:r>
         <w:rPr>
@@ -11968,7 +11968,7 @@
           <w:b/>
           <w:sz w:val="28"/>
         </w:rPr>
-        <w:t xml:space="preserve">本节只规定计算任务的物理分配与数据汇总，不改变版本 </w:t>
+        <w:t xml:space="preserve"/>
       </w:r>
       <w:r>
         <w:rPr>
@@ -11976,7 +11976,7 @@
           <w:b/>
           <w:sz w:val="28"/>
         </w:rPr>
-        <w:t xml:space="preserve">1.3 </w:t>
+        <w:t xml:space="preserve"/>
       </w:r>
       <w:r>
         <w:rPr>
@@ -11984,7 +11984,7 @@
           <w:b/>
           <w:sz w:val="28"/>
         </w:rPr>
-        <w:t>已冻结的模型、实验条件、样本量、恢复判据、</w:t>
+        <w:t/>
       </w:r>
       <w:r>
         <w:rPr>
@@ -11992,7 +11992,7 @@
           <w:b/>
           <w:sz w:val="28"/>
         </w:rPr>
-        <w:t xml:space="preserve">margin </w:t>
+        <w:t xml:space="preserve"/>
       </w:r>
       <w:r>
         <w:rPr>
@@ -12000,7 +12000,7 @@
           <w:b/>
           <w:sz w:val="28"/>
         </w:rPr>
-        <w:t xml:space="preserve">边界或统计方法。三台服务器必须检出同一冻结标签 </w:t>
+        <w:t xml:space="preserve"/>
       </w:r>
       <w:r>
         <w:rPr>
@@ -12008,7 +12008,7 @@
           <w:b/>
           <w:sz w:val="28"/>
         </w:rPr>
-        <w:t>paper-eval-v1.3-frozen</w:t>
+        <w:t/>
       </w:r>
       <w:r>
         <w:rPr>
@@ -12016,7 +12016,7 @@
           <w:b/>
           <w:sz w:val="28"/>
         </w:rPr>
-        <w:t xml:space="preserve">（提交 </w:t>
+        <w:t xml:space="preserve"/>
       </w:r>
       <w:r>
         <w:rPr>
@@ -12024,7 +12024,7 @@
           <w:b/>
           <w:sz w:val="28"/>
         </w:rPr>
-        <w:t>4434d384cea959025a31c4fad1fd056b3fc017f5</w:t>
+        <w:t/>
       </w:r>
       <w:r>
         <w:rPr>
@@ -12032,7 +12032,7 @@
           <w:b/>
           <w:sz w:val="28"/>
         </w:rPr>
-        <w:t>），并核验协议哈希、</w:t>
+        <w:t/>
       </w:r>
       <w:r>
         <w:rPr>
@@ -12040,7 +12040,7 @@
           <w:b/>
           <w:sz w:val="28"/>
         </w:rPr>
-        <w:t xml:space="preserve">manifest </w:t>
+        <w:t xml:space="preserve"/>
       </w:r>
       <w:r>
         <w:rPr>
@@ -12048,7 +12048,7 @@
           <w:b/>
           <w:sz w:val="28"/>
         </w:rPr>
-        <w:t xml:space="preserve">哈希、模型 </w:t>
+        <w:t xml:space="preserve"/>
       </w:r>
       <w:r>
         <w:rPr>
@@ -12056,7 +12056,7 @@
           <w:b/>
           <w:sz w:val="28"/>
         </w:rPr>
-        <w:t>checkpoint SHA-256</w:t>
+        <w:t/>
       </w:r>
       <w:r>
         <w:rPr>
@@ -12064,7 +12064,7 @@
           <w:b/>
           <w:sz w:val="28"/>
         </w:rPr>
-        <w:t>、资产哈希和仿真器版本。</w:t>
+        <w:t/>
       </w:r>
       <w:r>
         <w:rPr>
@@ -12080,7 +12080,7 @@
           <w:b/>
           <w:sz w:val="28"/>
         </w:rPr>
-        <w:t xml:space="preserve">十三一 </w:t>
+        <w:t xml:space="preserve"/>
       </w:r>
       <w:r>
         <w:rPr>
@@ -12088,7 +12088,7 @@
           <w:b/>
           <w:sz w:val="28"/>
         </w:rPr>
-        <w:t xml:space="preserve">eval seed </w:t>
+        <w:t xml:space="preserve"/>
       </w:r>
       <w:r>
         <w:rPr>
@@ -12096,7 +12096,7 @@
           <w:b/>
           <w:sz w:val="28"/>
         </w:rPr>
-        <w:t>的唯一规则</w:t>
+        <w:t/>
       </w:r>
       <w:r>
         <w:rPr>
@@ -12105,7 +12105,7 @@
           <w:sz w:val="28"/>
         </w:rPr>
         <w:br/>
-        <w:t>screening</w:t>
+        <w:t/>
       </w:r>
       <w:r>
         <w:rPr>
@@ -12113,7 +12113,7 @@
           <w:b/>
           <w:sz w:val="28"/>
         </w:rPr>
-        <w:t>、</w:t>
+        <w:t/>
       </w:r>
       <w:r>
         <w:rPr>
@@ -12121,7 +12121,7 @@
           <w:b/>
           <w:sz w:val="28"/>
         </w:rPr>
-        <w:t>pilot</w:t>
+        <w:t/>
       </w:r>
       <w:r>
         <w:rPr>
@@ -12129,7 +12129,7 @@
           <w:b/>
           <w:sz w:val="28"/>
         </w:rPr>
-        <w:t>、</w:t>
+        <w:t/>
       </w:r>
       <w:r>
         <w:rPr>
@@ -12137,7 +12137,7 @@
           <w:b/>
           <w:sz w:val="28"/>
         </w:rPr>
-        <w:t xml:space="preserve">formal </w:t>
+        <w:t xml:space="preserve"/>
       </w:r>
       <w:r>
         <w:rPr>
@@ -12145,7 +12145,7 @@
           <w:b/>
           <w:sz w:val="28"/>
         </w:rPr>
-        <w:t xml:space="preserve">的 </w:t>
+        <w:t xml:space="preserve"/>
       </w:r>
       <w:r>
         <w:rPr>
@@ -12153,7 +12153,7 @@
           <w:b/>
           <w:sz w:val="28"/>
         </w:rPr>
-        <w:t xml:space="preserve">seed namespace </w:t>
+        <w:t xml:space="preserve"/>
       </w:r>
       <w:r>
         <w:rPr>
@@ -12161,7 +12161,7 @@
           <w:b/>
           <w:sz w:val="28"/>
         </w:rPr>
-        <w:t xml:space="preserve">分别固定为 </w:t>
+        <w:t xml:space="preserve"/>
       </w:r>
       <w:r>
         <w:rPr>
@@ -12169,7 +12169,7 @@
           <w:b/>
           <w:sz w:val="28"/>
         </w:rPr>
-        <w:t>1301000</w:t>
+        <w:t/>
       </w:r>
       <w:r>
         <w:rPr>
@@ -12177,7 +12177,7 @@
           <w:b/>
           <w:sz w:val="28"/>
         </w:rPr>
-        <w:t>、</w:t>
+        <w:t/>
       </w:r>
       <w:r>
         <w:rPr>
@@ -12185,7 +12185,7 @@
           <w:b/>
           <w:sz w:val="28"/>
         </w:rPr>
-        <w:t>1302000</w:t>
+        <w:t/>
       </w:r>
       <w:r>
         <w:rPr>
@@ -12193,7 +12193,7 @@
           <w:b/>
           <w:sz w:val="28"/>
         </w:rPr>
-        <w:t>、</w:t>
+        <w:t/>
       </w:r>
       <w:r>
         <w:rPr>
@@ -12201,7 +12201,7 @@
           <w:b/>
           <w:sz w:val="28"/>
         </w:rPr>
-        <w:t>1303000</w:t>
+        <w:t/>
       </w:r>
       <w:r>
         <w:rPr>
@@ -12209,7 +12209,7 @@
           <w:b/>
           <w:sz w:val="28"/>
         </w:rPr>
-        <w:t xml:space="preserve">。每条试验使用 </w:t>
+        <w:t xml:space="preserve"/>
       </w:r>
       <w:r>
         <w:rPr>
@@ -12217,7 +12217,7 @@
           <w:b/>
           <w:sz w:val="28"/>
         </w:rPr>
-        <w:t>eval_seed = seed_namespace(stage) + experiment_id × 1000000 + global_sequence</w:t>
+        <w:t/>
       </w:r>
       <w:r>
         <w:rPr>
@@ -12225,7 +12225,7 @@
           <w:b/>
           <w:sz w:val="28"/>
         </w:rPr>
-        <w:t xml:space="preserve">。因此正式实验一从 </w:t>
+        <w:t xml:space="preserve"/>
       </w:r>
       <w:r>
         <w:rPr>
@@ -12233,7 +12233,7 @@
           <w:b/>
           <w:sz w:val="28"/>
         </w:rPr>
-        <w:t xml:space="preserve">2303000 </w:t>
+        <w:t xml:space="preserve"/>
       </w:r>
       <w:r>
         <w:rPr>
@@ -12241,7 +12241,7 @@
           <w:b/>
           <w:sz w:val="28"/>
         </w:rPr>
-        <w:t xml:space="preserve">开始，正式实验二从 </w:t>
+        <w:t xml:space="preserve"/>
       </w:r>
       <w:r>
         <w:rPr>
@@ -12249,7 +12249,7 @@
           <w:b/>
           <w:sz w:val="28"/>
         </w:rPr>
-        <w:t xml:space="preserve">3303000 </w:t>
+        <w:t xml:space="preserve"/>
       </w:r>
       <w:r>
         <w:rPr>
@@ -12257,7 +12257,7 @@
           <w:b/>
           <w:sz w:val="28"/>
         </w:rPr>
-        <w:t xml:space="preserve">开始，正式实验三从 </w:t>
+        <w:t xml:space="preserve"/>
       </w:r>
       <w:r>
         <w:rPr>
@@ -12265,7 +12265,7 @@
           <w:b/>
           <w:sz w:val="28"/>
         </w:rPr>
-        <w:t xml:space="preserve">4303000 </w:t>
+        <w:t xml:space="preserve"/>
       </w:r>
       <w:r>
         <w:rPr>
@@ -12273,7 +12273,7 @@
           <w:b/>
           <w:sz w:val="28"/>
         </w:rPr>
-        <w:t>开始。</w:t>
+        <w:t/>
       </w:r>
       <w:r>
         <w:rPr>
@@ -12281,7 +12281,7 @@
           <w:b/>
           <w:sz w:val="28"/>
         </w:rPr>
-        <w:t xml:space="preserve">trial_id </w:t>
+        <w:t xml:space="preserve"/>
       </w:r>
       <w:r>
         <w:rPr>
@@ -12289,7 +12289,7 @@
           <w:b/>
           <w:sz w:val="28"/>
         </w:rPr>
-        <w:t>使用协议版本、</w:t>
+        <w:t/>
       </w:r>
       <w:r>
         <w:rPr>
@@ -12297,7 +12297,7 @@
           <w:b/>
           <w:sz w:val="28"/>
         </w:rPr>
-        <w:t>stage</w:t>
+        <w:t/>
       </w:r>
       <w:r>
         <w:rPr>
@@ -12305,7 +12305,7 @@
           <w:b/>
           <w:sz w:val="28"/>
         </w:rPr>
-        <w:t>、</w:t>
+        <w:t/>
       </w:r>
       <w:r>
         <w:rPr>
@@ -12313,7 +12313,7 @@
           <w:b/>
           <w:sz w:val="28"/>
         </w:rPr>
-        <w:t xml:space="preserve">experiment_id </w:t>
+        <w:t xml:space="preserve"/>
       </w:r>
       <w:r>
         <w:rPr>
@@ -12321,7 +12321,7 @@
           <w:b/>
           <w:sz w:val="28"/>
         </w:rPr>
-        <w:t xml:space="preserve">和 </w:t>
+        <w:t xml:space="preserve"/>
       </w:r>
       <w:r>
         <w:rPr>
@@ -12329,7 +12329,7 @@
           <w:b/>
           <w:sz w:val="28"/>
         </w:rPr>
-        <w:t xml:space="preserve">global_sequence </w:t>
+        <w:t xml:space="preserve"/>
       </w:r>
       <w:r>
         <w:rPr>
@@ -12337,7 +12337,7 @@
           <w:b/>
           <w:sz w:val="28"/>
         </w:rPr>
-        <w:t>构造。</w:t>
+        <w:t/>
       </w:r>
       <w:r>
         <w:rPr>
@@ -12345,7 +12345,7 @@
           <w:b/>
           <w:sz w:val="28"/>
         </w:rPr>
-        <w:t>worker id</w:t>
+        <w:t/>
       </w:r>
       <w:r>
         <w:rPr>
@@ -12353,7 +12353,7 @@
           <w:b/>
           <w:sz w:val="28"/>
         </w:rPr>
-        <w:t>、主机名、</w:t>
+        <w:t/>
       </w:r>
       <w:r>
         <w:rPr>
@@ -12361,7 +12361,7 @@
           <w:b/>
           <w:sz w:val="28"/>
         </w:rPr>
-        <w:t xml:space="preserve">GPU </w:t>
+        <w:t xml:space="preserve"/>
       </w:r>
       <w:r>
         <w:rPr>
@@ -12369,7 +12369,7 @@
           <w:b/>
           <w:sz w:val="28"/>
         </w:rPr>
-        <w:t xml:space="preserve">编号和服务器编号不得参与 </w:t>
+        <w:t xml:space="preserve"/>
       </w:r>
       <w:r>
         <w:rPr>
@@ -12377,7 +12377,7 @@
           <w:b/>
           <w:sz w:val="28"/>
         </w:rPr>
-        <w:t xml:space="preserve">seed </w:t>
+        <w:t xml:space="preserve"/>
       </w:r>
       <w:r>
         <w:rPr>
@@ -12385,7 +12385,7 @@
           <w:b/>
           <w:sz w:val="28"/>
         </w:rPr>
-        <w:t xml:space="preserve">或 </w:t>
+        <w:t xml:space="preserve"/>
       </w:r>
       <w:r>
         <w:rPr>
@@ -12393,7 +12393,7 @@
           <w:b/>
           <w:sz w:val="28"/>
         </w:rPr>
-        <w:t xml:space="preserve">trial_id </w:t>
+        <w:t xml:space="preserve"/>
       </w:r>
       <w:r>
         <w:rPr>
@@ -12401,7 +12401,7 @@
           <w:b/>
           <w:sz w:val="28"/>
         </w:rPr>
-        <w:t xml:space="preserve">计算，也不得由各服务器私自增加 </w:t>
+        <w:t xml:space="preserve"/>
       </w:r>
       <w:r>
         <w:rPr>
@@ -12409,7 +12409,7 @@
           <w:b/>
           <w:sz w:val="28"/>
         </w:rPr>
-        <w:t>seed offset</w:t>
+        <w:t/>
       </w:r>
       <w:r>
         <w:rPr>
@@ -12417,7 +12417,7 @@
           <w:b/>
           <w:sz w:val="28"/>
         </w:rPr>
-        <w:t>。</w:t>
+        <w:t/>
       </w:r>
       <w:r>
         <w:rPr>
@@ -12433,7 +12433,7 @@
           <w:b/>
           <w:sz w:val="28"/>
         </w:rPr>
-        <w:t xml:space="preserve">不同模型在相同 </w:t>
+        <w:t xml:space="preserve"/>
       </w:r>
       <w:r>
         <w:rPr>
@@ -12441,7 +12441,7 @@
           <w:b/>
           <w:sz w:val="28"/>
         </w:rPr>
-        <w:t>stage</w:t>
+        <w:t/>
       </w:r>
       <w:r>
         <w:rPr>
@@ -12449,7 +12449,7 @@
           <w:b/>
           <w:sz w:val="28"/>
         </w:rPr>
-        <w:t>、</w:t>
+        <w:t/>
       </w:r>
       <w:r>
         <w:rPr>
@@ -12457,7 +12457,7 @@
           <w:b/>
           <w:sz w:val="28"/>
         </w:rPr>
-        <w:t xml:space="preserve">experiment_id </w:t>
+        <w:t xml:space="preserve"/>
       </w:r>
       <w:r>
         <w:rPr>
@@ -12465,7 +12465,7 @@
           <w:b/>
           <w:sz w:val="28"/>
         </w:rPr>
-        <w:t xml:space="preserve">和 </w:t>
+        <w:t xml:space="preserve"/>
       </w:r>
       <w:r>
         <w:rPr>
@@ -12473,7 +12473,7 @@
           <w:b/>
           <w:sz w:val="28"/>
         </w:rPr>
-        <w:t xml:space="preserve">global_sequence </w:t>
+        <w:t xml:space="preserve"/>
       </w:r>
       <w:r>
         <w:rPr>
@@ -12481,7 +12481,7 @@
           <w:b/>
           <w:sz w:val="28"/>
         </w:rPr>
-        <w:t xml:space="preserve">上必须使用相同 </w:t>
+        <w:t xml:space="preserve"/>
       </w:r>
       <w:r>
         <w:rPr>
@@ -12489,7 +12489,7 @@
           <w:b/>
           <w:sz w:val="28"/>
         </w:rPr>
-        <w:t xml:space="preserve">eval_seed </w:t>
+        <w:t xml:space="preserve"/>
       </w:r>
       <w:r>
         <w:rPr>
@@ -12497,7 +12497,7 @@
           <w:b/>
           <w:sz w:val="28"/>
         </w:rPr>
-        <w:t xml:space="preserve">与同一条预生成 </w:t>
+        <w:t xml:space="preserve"/>
       </w:r>
       <w:r>
         <w:rPr>
@@ -12505,7 +12505,7 @@
           <w:b/>
           <w:sz w:val="28"/>
         </w:rPr>
-        <w:t>trial manifest</w:t>
+        <w:t/>
       </w:r>
       <w:r>
         <w:rPr>
@@ -12513,7 +12513,7 @@
           <w:b/>
           <w:sz w:val="28"/>
         </w:rPr>
-        <w:t xml:space="preserve">，以保持 </w:t>
+        <w:t xml:space="preserve"/>
       </w:r>
       <w:r>
         <w:rPr>
@@ -12521,7 +12521,7 @@
           <w:b/>
           <w:sz w:val="28"/>
         </w:rPr>
-        <w:t xml:space="preserve">common random numbers </w:t>
+        <w:t xml:space="preserve"/>
       </w:r>
       <w:r>
         <w:rPr>
@@ -12529,7 +12529,7 @@
           <w:b/>
           <w:sz w:val="28"/>
         </w:rPr>
-        <w:t xml:space="preserve">和配对比较。相同 </w:t>
+        <w:t xml:space="preserve"/>
       </w:r>
       <w:r>
         <w:rPr>
@@ -12537,7 +12537,7 @@
           <w:b/>
           <w:sz w:val="28"/>
         </w:rPr>
-        <w:t xml:space="preserve">eval_seed </w:t>
+        <w:t xml:space="preserve"/>
       </w:r>
       <w:r>
         <w:rPr>
@@ -12545,7 +12545,7 @@
           <w:b/>
           <w:sz w:val="28"/>
         </w:rPr>
-        <w:t xml:space="preserve">出现在不同模型中是预期的配对设计；相同 </w:t>
+        <w:t xml:space="preserve"/>
       </w:r>
       <w:r>
         <w:rPr>
@@ -12553,7 +12553,7 @@
           <w:b/>
           <w:sz w:val="28"/>
         </w:rPr>
-        <w:t>model_id</w:t>
+        <w:t/>
       </w:r>
       <w:r>
         <w:rPr>
@@ -12561,7 +12561,7 @@
           <w:b/>
           <w:sz w:val="28"/>
         </w:rPr>
-        <w:t>、</w:t>
+        <w:t/>
       </w:r>
       <w:r>
         <w:rPr>
@@ -12569,7 +12569,7 @@
           <w:b/>
           <w:sz w:val="28"/>
         </w:rPr>
-        <w:t xml:space="preserve">single training run id </w:t>
+        <w:t xml:space="preserve"/>
       </w:r>
       <w:r>
         <w:rPr>
@@ -12577,7 +12577,7 @@
           <w:b/>
           <w:sz w:val="28"/>
         </w:rPr>
-        <w:t xml:space="preserve">和 </w:t>
+        <w:t xml:space="preserve"/>
       </w:r>
       <w:r>
         <w:rPr>
@@ -12585,7 +12585,7 @@
           <w:b/>
           <w:sz w:val="28"/>
         </w:rPr>
-        <w:t xml:space="preserve">trial_id </w:t>
+        <w:t xml:space="preserve"/>
       </w:r>
       <w:r>
         <w:rPr>
@@ -12593,7 +12593,7 @@
           <w:b/>
           <w:sz w:val="28"/>
         </w:rPr>
-        <w:t>重复出现才是冲突。</w:t>
+        <w:t/>
       </w:r>
       <w:r>
         <w:rPr>
@@ -12601,7 +12601,7 @@
           <w:b/>
           <w:sz w:val="28"/>
         </w:rPr>
-        <w:t xml:space="preserve">pilot </w:t>
+        <w:t xml:space="preserve"/>
       </w:r>
       <w:r>
         <w:rPr>
@@ -12609,7 +12609,7 @@
           <w:b/>
           <w:sz w:val="28"/>
         </w:rPr>
-        <w:t>与</w:t>
+        <w:t/>
       </w:r>
       <w:r>
         <w:rPr>
@@ -12617,7 +12617,7 @@
           <w:b/>
           <w:sz w:val="28"/>
         </w:rPr>
-        <w:t xml:space="preserve">formal </w:t>
+        <w:t xml:space="preserve"/>
       </w:r>
       <w:r>
         <w:rPr>
@@ -12625,7 +12625,7 @@
           <w:b/>
           <w:sz w:val="28"/>
         </w:rPr>
-        <w:t xml:space="preserve">的 </w:t>
+        <w:t xml:space="preserve"/>
       </w:r>
       <w:r>
         <w:rPr>
@@ -12633,7 +12633,7 @@
           <w:b/>
           <w:sz w:val="28"/>
         </w:rPr>
-        <w:t>namespace</w:t>
+        <w:t/>
       </w:r>
       <w:r>
         <w:rPr>
@@ -12641,7 +12641,7 @@
           <w:b/>
           <w:sz w:val="28"/>
         </w:rPr>
-        <w:t>、</w:t>
+        <w:t/>
       </w:r>
       <w:r>
         <w:rPr>
@@ -12649,7 +12649,7 @@
           <w:b/>
           <w:sz w:val="28"/>
         </w:rPr>
-        <w:t xml:space="preserve">trial_id </w:t>
+        <w:t xml:space="preserve"/>
       </w:r>
       <w:r>
         <w:rPr>
@@ -12657,7 +12657,7 @@
           <w:b/>
           <w:sz w:val="28"/>
         </w:rPr>
-        <w:t xml:space="preserve">和 </w:t>
+        <w:t xml:space="preserve"/>
       </w:r>
       <w:r>
         <w:rPr>
@@ -12665,7 +12665,7 @@
           <w:b/>
           <w:sz w:val="28"/>
         </w:rPr>
-        <w:t xml:space="preserve">eval_seed </w:t>
+        <w:t xml:space="preserve"/>
       </w:r>
       <w:r>
         <w:rPr>
@@ -12673,7 +12673,7 @@
           <w:b/>
           <w:sz w:val="28"/>
         </w:rPr>
-        <w:t>必须互斥。</w:t>
+        <w:t/>
       </w:r>
       <w:r>
         <w:rPr>
@@ -12689,7 +12689,7 @@
           <w:b/>
           <w:sz w:val="28"/>
         </w:rPr>
-        <w:t>十三二 等价服务器与用户自定义任务分配</w:t>
+        <w:t/>
       </w:r>
       <w:r>
         <w:rPr>
@@ -12705,7 +12705,7 @@
           <w:b/>
           <w:sz w:val="28"/>
         </w:rPr>
-        <w:t>三台服务器按配置与权限等价处理，不设置主服务器，也不规定服务器与模型的固定对应关系。用户可以用自然语言向任意服务器指定要使用的模型、阶段、实验或任意实验组合；协议不设置固定任务范围或命令菜单。</w:t>
+        <w:t/>
       </w:r>
       <w:r>
         <w:rPr>
@@ -12713,7 +12713,7 @@
           <w:b/>
           <w:sz w:val="28"/>
         </w:rPr>
-        <w:t>A</w:t>
+        <w:t/>
       </w:r>
       <w:r>
         <w:rPr>
@@ -12721,7 +12721,7 @@
           <w:b/>
           <w:sz w:val="28"/>
         </w:rPr>
-        <w:t>、</w:t>
+        <w:t/>
       </w:r>
       <w:r>
         <w:rPr>
@@ -12729,7 +12729,7 @@
           <w:b/>
           <w:sz w:val="28"/>
         </w:rPr>
-        <w:t>B</w:t>
+        <w:t/>
       </w:r>
       <w:r>
         <w:rPr>
@@ -12737,7 +12737,7 @@
           <w:b/>
           <w:sz w:val="28"/>
         </w:rPr>
-        <w:t>、</w:t>
+        <w:t/>
       </w:r>
       <w:r>
         <w:rPr>
@@ -12745,7 +12745,7 @@
           <w:b/>
           <w:sz w:val="28"/>
         </w:rPr>
-        <w:t xml:space="preserve">C </w:t>
+        <w:t xml:space="preserve"/>
       </w:r>
       <w:r>
         <w:rPr>
@@ -12753,7 +12753,7 @@
           <w:b/>
           <w:sz w:val="28"/>
         </w:rPr>
-        <w:t xml:space="preserve">任意一台均可运行任意已注册并冻结的模型。同一个模型也可以在多台服务器上运行，只要它们负责不同的 </w:t>
+        <w:t xml:space="preserve"/>
       </w:r>
       <w:r>
         <w:rPr>
@@ -12761,7 +12761,7 @@
           <w:b/>
           <w:sz w:val="28"/>
         </w:rPr>
-        <w:t xml:space="preserve">stage </w:t>
+        <w:t xml:space="preserve"/>
       </w:r>
       <w:r>
         <w:rPr>
@@ -12769,7 +12769,7 @@
           <w:b/>
           <w:sz w:val="28"/>
         </w:rPr>
-        <w:t xml:space="preserve">或 </w:t>
+        <w:t xml:space="preserve"/>
       </w:r>
       <w:r>
         <w:rPr>
@@ -12777,7 +12777,7 @@
           <w:b/>
           <w:sz w:val="28"/>
         </w:rPr>
-        <w:t>experiment shard</w:t>
+        <w:t/>
       </w:r>
       <w:r>
         <w:rPr>
@@ -12785,7 +12785,7 @@
           <w:b/>
           <w:sz w:val="28"/>
         </w:rPr>
-        <w:t xml:space="preserve">。不同服务器可以使用同一份模型无关 </w:t>
+        <w:t xml:space="preserve"/>
       </w:r>
       <w:r>
         <w:rPr>
@@ -12793,7 +12793,7 @@
           <w:b/>
           <w:sz w:val="28"/>
         </w:rPr>
-        <w:t xml:space="preserve">manifest </w:t>
+        <w:t xml:space="preserve"/>
       </w:r>
       <w:r>
         <w:rPr>
@@ -12801,7 +12801,7 @@
           <w:b/>
           <w:sz w:val="28"/>
         </w:rPr>
-        <w:t xml:space="preserve">和配对 </w:t>
+        <w:t xml:space="preserve"/>
       </w:r>
       <w:r>
         <w:rPr>
@@ -12809,7 +12809,7 @@
           <w:b/>
           <w:sz w:val="28"/>
         </w:rPr>
-        <w:t xml:space="preserve">eval_seed </w:t>
+        <w:t xml:space="preserve"/>
       </w:r>
       <w:r>
         <w:rPr>
@@ -12817,7 +12817,7 @@
           <w:b/>
           <w:sz w:val="28"/>
         </w:rPr>
-        <w:t xml:space="preserve">分别评测相同或不同模型。以完整 </w:t>
+        <w:t xml:space="preserve"/>
       </w:r>
       <w:r>
         <w:rPr>
@@ -12825,7 +12825,7 @@
           <w:b/>
           <w:sz w:val="28"/>
         </w:rPr>
-        <w:t xml:space="preserve">model-experiment shard </w:t>
+        <w:t xml:space="preserve"/>
       </w:r>
       <w:r>
         <w:rPr>
@@ -12833,7 +12833,7 @@
           <w:b/>
           <w:sz w:val="28"/>
         </w:rPr>
-        <w:t xml:space="preserve">为最小执行单元，其唯一键为 </w:t>
+        <w:t xml:space="preserve"/>
       </w:r>
       <w:r>
         <w:rPr>
@@ -12841,7 +12841,7 @@
           <w:b/>
           <w:sz w:val="28"/>
         </w:rPr>
-        <w:t>protocol_hash</w:t>
+        <w:t/>
       </w:r>
       <w:r>
         <w:rPr>
@@ -12849,7 +12849,7 @@
           <w:b/>
           <w:sz w:val="28"/>
         </w:rPr>
-        <w:t>、</w:t>
+        <w:t/>
       </w:r>
       <w:r>
         <w:rPr>
@@ -12857,7 +12857,7 @@
           <w:b/>
           <w:sz w:val="28"/>
         </w:rPr>
-        <w:t>stage</w:t>
+        <w:t/>
       </w:r>
       <w:r>
         <w:rPr>
@@ -12865,7 +12865,7 @@
           <w:b/>
           <w:sz w:val="28"/>
         </w:rPr>
-        <w:t>、</w:t>
+        <w:t/>
       </w:r>
       <w:r>
         <w:rPr>
@@ -12873,7 +12873,7 @@
           <w:b/>
           <w:sz w:val="28"/>
         </w:rPr>
-        <w:t>experiment_id</w:t>
+        <w:t/>
       </w:r>
       <w:r>
         <w:rPr>
@@ -12881,7 +12881,7 @@
           <w:b/>
           <w:sz w:val="28"/>
         </w:rPr>
-        <w:t>、</w:t>
+        <w:t/>
       </w:r>
       <w:r>
         <w:rPr>
@@ -12889,7 +12889,7 @@
           <w:b/>
           <w:sz w:val="28"/>
         </w:rPr>
-        <w:t>model_id</w:t>
+        <w:t/>
       </w:r>
       <w:r>
         <w:rPr>
@@ -12897,7 +12897,7 @@
           <w:b/>
           <w:sz w:val="28"/>
         </w:rPr>
-        <w:t>、</w:t>
+        <w:t/>
       </w:r>
       <w:r>
         <w:rPr>
@@ -12905,7 +12905,7 @@
           <w:b/>
           <w:sz w:val="28"/>
         </w:rPr>
-        <w:t xml:space="preserve">single training run id </w:t>
+        <w:t xml:space="preserve"/>
       </w:r>
       <w:r>
         <w:rPr>
@@ -12913,7 +12913,7 @@
           <w:b/>
           <w:sz w:val="28"/>
         </w:rPr>
-        <w:t xml:space="preserve">和 </w:t>
+        <w:t xml:space="preserve"/>
       </w:r>
       <w:r>
         <w:rPr>
@@ -12921,7 +12921,7 @@
           <w:b/>
           <w:sz w:val="28"/>
         </w:rPr>
-        <w:t>manifest_hash</w:t>
+        <w:t/>
       </w:r>
       <w:r>
         <w:rPr>
@@ -12929,7 +12929,7 @@
           <w:b/>
           <w:sz w:val="28"/>
         </w:rPr>
-        <w:t xml:space="preserve">。同一个 </w:t>
+        <w:t xml:space="preserve"/>
       </w:r>
       <w:r>
         <w:rPr>
@@ -12937,7 +12937,7 @@
           <w:b/>
           <w:sz w:val="28"/>
         </w:rPr>
-        <w:t xml:space="preserve">shard </w:t>
+        <w:t xml:space="preserve"/>
       </w:r>
       <w:r>
         <w:rPr>
@@ -12945,7 +12945,7 @@
           <w:b/>
           <w:sz w:val="28"/>
         </w:rPr>
-        <w:t xml:space="preserve">在任一时刻只允许一台服务器写入，禁止两台服务器同时运行同一模型的同一实验。若以后必须跨服务器拆分同一 </w:t>
+        <w:t xml:space="preserve"/>
       </w:r>
       <w:r>
         <w:rPr>
@@ -12953,7 +12953,7 @@
           <w:b/>
           <w:sz w:val="28"/>
         </w:rPr>
-        <w:t>model-experiment shard</w:t>
+        <w:t/>
       </w:r>
       <w:r>
         <w:rPr>
@@ -12961,7 +12961,7 @@
           <w:b/>
           <w:sz w:val="28"/>
         </w:rPr>
-        <w:t xml:space="preserve">，必须先生成冻结的全局分片 </w:t>
+        <w:t xml:space="preserve"/>
       </w:r>
       <w:r>
         <w:rPr>
@@ -12969,7 +12969,7 @@
           <w:b/>
           <w:sz w:val="28"/>
         </w:rPr>
-        <w:t>manifest</w:t>
+        <w:t/>
       </w:r>
       <w:r>
         <w:rPr>
@@ -12977,7 +12977,7 @@
           <w:b/>
           <w:sz w:val="28"/>
         </w:rPr>
-        <w:t xml:space="preserve">，并按 </w:t>
+        <w:t xml:space="preserve"/>
       </w:r>
       <w:r>
         <w:rPr>
@@ -12985,7 +12985,7 @@
           <w:b/>
           <w:sz w:val="28"/>
         </w:rPr>
-        <w:t xml:space="preserve">global_sequence </w:t>
+        <w:t xml:space="preserve"/>
       </w:r>
       <w:r>
         <w:rPr>
@@ -12993,7 +12993,7 @@
           <w:b/>
           <w:sz w:val="28"/>
         </w:rPr>
-        <w:t xml:space="preserve">对服务器数取模分配 </w:t>
+        <w:t xml:space="preserve"/>
       </w:r>
       <w:r>
         <w:rPr>
@@ -13001,7 +13001,7 @@
           <w:b/>
           <w:sz w:val="28"/>
         </w:rPr>
-        <w:t>shard_index</w:t>
+        <w:t/>
       </w:r>
       <w:r>
         <w:rPr>
@@ -13009,7 +13009,7 @@
           <w:b/>
           <w:sz w:val="28"/>
         </w:rPr>
-        <w:t>；在该功能通过自动测试和冻结前不得自行拆分。</w:t>
+        <w:t/>
       </w:r>
       <w:r>
         <w:rPr>
@@ -13025,7 +13025,7 @@
           <w:b/>
           <w:sz w:val="28"/>
         </w:rPr>
-        <w:t xml:space="preserve">截至 </w:t>
+        <w:t xml:space="preserve"/>
       </w:r>
       <w:r>
         <w:rPr>
@@ -13033,7 +13033,7 @@
           <w:b/>
           <w:sz w:val="28"/>
         </w:rPr>
-        <w:t>2026-09-13</w:t>
+        <w:t/>
       </w:r>
       <w:r>
         <w:rPr>
@@ -13041,7 +13041,7 @@
           <w:b/>
           <w:sz w:val="28"/>
         </w:rPr>
-        <w:t xml:space="preserve">，正式实验一 </w:t>
+        <w:t xml:space="preserve"/>
       </w:r>
       <w:r>
         <w:rPr>
@@ -13049,7 +13049,7 @@
           <w:b/>
           <w:sz w:val="28"/>
         </w:rPr>
-        <w:t xml:space="preserve">M1 </w:t>
+        <w:t xml:space="preserve"/>
       </w:r>
       <w:r>
         <w:rPr>
@@ -13057,7 +13057,7 @@
           <w:b/>
           <w:sz w:val="28"/>
         </w:rPr>
-        <w:t xml:space="preserve">已逐批原子落盘 </w:t>
+        <w:t xml:space="preserve"/>
       </w:r>
       <w:r>
         <w:rPr>
@@ -13065,7 +13065,7 @@
           <w:b/>
           <w:sz w:val="28"/>
         </w:rPr>
-        <w:t xml:space="preserve">global_sequence 0 </w:t>
+        <w:t xml:space="preserve"/>
       </w:r>
       <w:r>
         <w:rPr>
@@ -13073,7 +13073,7 @@
           <w:b/>
           <w:sz w:val="28"/>
         </w:rPr>
-        <w:t xml:space="preserve">至 </w:t>
+        <w:t xml:space="preserve"/>
       </w:r>
       <w:r>
         <w:rPr>
@@ -13081,7 +13081,7 @@
           <w:b/>
           <w:sz w:val="28"/>
         </w:rPr>
-        <w:t>18383</w:t>
+        <w:t/>
       </w:r>
       <w:r>
         <w:rPr>
@@ -13089,7 +13089,7 @@
           <w:b/>
           <w:sz w:val="28"/>
         </w:rPr>
-        <w:t xml:space="preserve">，共 </w:t>
+        <w:t xml:space="preserve"/>
       </w:r>
       <w:r>
         <w:rPr>
@@ -13097,7 +13097,7 @@
           <w:b/>
           <w:sz w:val="28"/>
         </w:rPr>
-        <w:t xml:space="preserve">18384 </w:t>
+        <w:t xml:space="preserve"/>
       </w:r>
       <w:r>
         <w:rPr>
@@ -13105,7 +13105,7 @@
           <w:b/>
           <w:sz w:val="28"/>
         </w:rPr>
-        <w:t xml:space="preserve">条候选记录；等样本分析集为 </w:t>
+        <w:t xml:space="preserve"/>
       </w:r>
       <w:r>
         <w:rPr>
@@ -13113,7 +13113,7 @@
           <w:b/>
           <w:sz w:val="28"/>
         </w:rPr>
-        <w:t>882/1440</w:t>
+        <w:t/>
       </w:r>
       <w:r>
         <w:rPr>
@@ -13121,7 +13121,7 @@
           <w:b/>
           <w:sz w:val="28"/>
         </w:rPr>
-        <w:t xml:space="preserve">，该 </w:t>
+        <w:t xml:space="preserve"/>
       </w:r>
       <w:r>
         <w:rPr>
@@ -13129,7 +13129,7 @@
           <w:b/>
           <w:sz w:val="28"/>
         </w:rPr>
-        <w:t xml:space="preserve">shard </w:t>
+        <w:t xml:space="preserve"/>
       </w:r>
       <w:r>
         <w:rPr>
@@ -13137,7 +13137,7 @@
           <w:b/>
           <w:sz w:val="28"/>
         </w:rPr>
-        <w:t xml:space="preserve">当前暂停但尚未完成。该 </w:t>
+        <w:t xml:space="preserve"/>
       </w:r>
       <w:r>
         <w:rPr>
@@ -13145,7 +13145,7 @@
           <w:b/>
           <w:sz w:val="28"/>
         </w:rPr>
-        <w:t xml:space="preserve">shard </w:t>
+        <w:t xml:space="preserve"/>
       </w:r>
       <w:r>
         <w:rPr>
@@ -13153,7 +13153,7 @@
           <w:b/>
           <w:sz w:val="28"/>
         </w:rPr>
-        <w:t xml:space="preserve">可以在三台服务器中的任意一台继续，由用户选择；运行前必须把完整目录交给唯一执行服务器并完成校验，不得由多台服务器从相同 </w:t>
+        <w:t xml:space="preserve"/>
       </w:r>
       <w:r>
         <w:rPr>
@@ -13161,7 +13161,7 @@
           <w:b/>
           <w:sz w:val="28"/>
         </w:rPr>
-        <w:t xml:space="preserve">trial_id </w:t>
+        <w:t xml:space="preserve"/>
       </w:r>
       <w:r>
         <w:rPr>
@@ -13169,7 +13169,7 @@
           <w:b/>
           <w:sz w:val="28"/>
         </w:rPr>
-        <w:t>并行重新开始。接管前必须比较文件数量、</w:t>
+        <w:t/>
       </w:r>
       <w:r>
         <w:rPr>
@@ -13177,7 +13177,7 @@
           <w:b/>
           <w:sz w:val="28"/>
         </w:rPr>
-        <w:t>identity.json</w:t>
+        <w:t/>
       </w:r>
       <w:r>
         <w:rPr>
@@ -13185,7 +13185,7 @@
           <w:b/>
           <w:sz w:val="28"/>
         </w:rPr>
-        <w:t>、</w:t>
+        <w:t/>
       </w:r>
       <w:r>
         <w:rPr>
@@ -13193,7 +13193,7 @@
           <w:b/>
           <w:sz w:val="28"/>
         </w:rPr>
-        <w:t>candidate_schedule.json</w:t>
+        <w:t/>
       </w:r>
       <w:r>
         <w:rPr>
@@ -13201,7 +13201,7 @@
           <w:b/>
           <w:sz w:val="28"/>
         </w:rPr>
-        <w:t>、</w:t>
+        <w:t/>
       </w:r>
       <w:r>
         <w:rPr>
@@ -13209,7 +13209,7 @@
           <w:b/>
           <w:sz w:val="28"/>
         </w:rPr>
-        <w:t xml:space="preserve">progress.json </w:t>
+        <w:t xml:space="preserve"/>
       </w:r>
       <w:r>
         <w:rPr>
@@ -13217,7 +13217,7 @@
           <w:b/>
           <w:sz w:val="28"/>
         </w:rPr>
-        <w:t>及所有记录哈希。</w:t>
+        <w:t/>
       </w:r>
       <w:r>
         <w:rPr>
@@ -13233,7 +13233,7 @@
           <w:b/>
           <w:sz w:val="28"/>
         </w:rPr>
-        <w:t>十三三 数据回收与合并门禁</w:t>
+        <w:t/>
       </w:r>
       <w:r>
         <w:rPr>
@@ -13249,7 +13249,7 @@
           <w:b/>
           <w:sz w:val="28"/>
         </w:rPr>
-        <w:t xml:space="preserve">每台服务器保留 </w:t>
+        <w:t xml:space="preserve"/>
       </w:r>
       <w:r>
         <w:rPr>
@@ -13257,7 +13257,7 @@
           <w:b/>
           <w:sz w:val="28"/>
         </w:rPr>
-        <w:t xml:space="preserve">append-only </w:t>
+        <w:t xml:space="preserve"/>
       </w:r>
       <w:r>
         <w:rPr>
@@ -13265,7 +13265,7 @@
           <w:b/>
           <w:sz w:val="28"/>
         </w:rPr>
-        <w:t xml:space="preserve">原始 </w:t>
+        <w:t xml:space="preserve"/>
       </w:r>
       <w:r>
         <w:rPr>
@@ -13273,7 +13273,7 @@
           <w:b/>
           <w:sz w:val="28"/>
         </w:rPr>
-        <w:t>records</w:t>
+        <w:t/>
       </w:r>
       <w:r>
         <w:rPr>
@@ -13281,7 +13281,7 @@
           <w:b/>
           <w:sz w:val="28"/>
         </w:rPr>
-        <w:t>、</w:t>
+        <w:t/>
       </w:r>
       <w:r>
         <w:rPr>
@@ -13289,7 +13289,7 @@
           <w:b/>
           <w:sz w:val="28"/>
         </w:rPr>
-        <w:t>traces</w:t>
+        <w:t/>
       </w:r>
       <w:r>
         <w:rPr>
@@ -13297,7 +13297,7 @@
           <w:b/>
           <w:sz w:val="28"/>
         </w:rPr>
-        <w:t>、</w:t>
+        <w:t/>
       </w:r>
       <w:r>
         <w:rPr>
@@ -13305,7 +13305,7 @@
           <w:b/>
           <w:sz w:val="28"/>
         </w:rPr>
-        <w:t>events</w:t>
+        <w:t/>
       </w:r>
       <w:r>
         <w:rPr>
@@ -13313,7 +13313,7 @@
           <w:b/>
           <w:sz w:val="28"/>
         </w:rPr>
-        <w:t>、</w:t>
+        <w:t/>
       </w:r>
       <w:r>
         <w:rPr>
@@ -13321,7 +13321,7 @@
           <w:b/>
           <w:sz w:val="28"/>
         </w:rPr>
-        <w:t>pre-reset snapshots</w:t>
+        <w:t/>
       </w:r>
       <w:r>
         <w:rPr>
@@ -13329,7 +13329,7 @@
           <w:b/>
           <w:sz w:val="28"/>
         </w:rPr>
-        <w:t>、</w:t>
+        <w:t/>
       </w:r>
       <w:r>
         <w:rPr>
@@ -13337,7 +13337,7 @@
           <w:b/>
           <w:sz w:val="28"/>
         </w:rPr>
-        <w:t>identity.json</w:t>
+        <w:t/>
       </w:r>
       <w:r>
         <w:rPr>
@@ -13345,7 +13345,7 @@
           <w:b/>
           <w:sz w:val="28"/>
         </w:rPr>
-        <w:t>、</w:t>
+        <w:t/>
       </w:r>
       <w:r>
         <w:rPr>
@@ -13353,7 +13353,7 @@
           <w:b/>
           <w:sz w:val="28"/>
         </w:rPr>
-        <w:t xml:space="preserve">completion.json </w:t>
+        <w:t xml:space="preserve"/>
       </w:r>
       <w:r>
         <w:rPr>
@@ -13361,7 +13361,7 @@
           <w:b/>
           <w:sz w:val="28"/>
         </w:rPr>
-        <w:t xml:space="preserve">和 </w:t>
+        <w:t xml:space="preserve"/>
       </w:r>
       <w:r>
         <w:rPr>
@@ -13369,7 +13369,7 @@
           <w:b/>
           <w:sz w:val="28"/>
         </w:rPr>
-        <w:t>sampling assignments</w:t>
+        <w:t/>
       </w:r>
       <w:r>
         <w:rPr>
@@ -13377,7 +13377,7 @@
           <w:b/>
           <w:sz w:val="28"/>
         </w:rPr>
-        <w:t xml:space="preserve">。只允许把带 </w:t>
+        <w:t xml:space="preserve"/>
       </w:r>
       <w:r>
         <w:rPr>
@@ -13385,7 +13385,7 @@
           <w:b/>
           <w:sz w:val="28"/>
         </w:rPr>
-        <w:t xml:space="preserve">COMPLETE seal </w:t>
+        <w:t xml:space="preserve"/>
       </w:r>
       <w:r>
         <w:rPr>
@@ -13393,7 +13393,7 @@
           <w:b/>
           <w:sz w:val="28"/>
         </w:rPr>
-        <w:t xml:space="preserve">的 </w:t>
+        <w:t xml:space="preserve"/>
       </w:r>
       <w:r>
         <w:rPr>
@@ -13401,7 +13401,7 @@
           <w:b/>
           <w:sz w:val="28"/>
         </w:rPr>
-        <w:t xml:space="preserve">shard </w:t>
+        <w:t xml:space="preserve"/>
       </w:r>
       <w:r>
         <w:rPr>
@@ -13409,7 +13409,7 @@
           <w:b/>
           <w:sz w:val="28"/>
         </w:rPr>
-        <w:t>纳入正式聚合；未完成</w:t>
+        <w:t/>
       </w:r>
       <w:r>
         <w:rPr>
@@ -13417,7 +13417,7 @@
           <w:b/>
           <w:sz w:val="28"/>
         </w:rPr>
-        <w:t xml:space="preserve">shard </w:t>
+        <w:t xml:space="preserve"/>
       </w:r>
       <w:r>
         <w:rPr>
@@ -13425,7 +13425,7 @@
           <w:b/>
           <w:sz w:val="28"/>
         </w:rPr>
-        <w:t xml:space="preserve">可备份和迁移，但不得进入论文统计。回收时复制整个 </w:t>
+        <w:t xml:space="preserve"/>
       </w:r>
       <w:r>
         <w:rPr>
@@ -13433,7 +13433,7 @@
           <w:b/>
           <w:sz w:val="28"/>
         </w:rPr>
-        <w:t xml:space="preserve">shard </w:t>
+        <w:t xml:space="preserve"/>
       </w:r>
       <w:r>
         <w:rPr>
@@ -13441,7 +13441,7 @@
           <w:b/>
           <w:sz w:val="28"/>
         </w:rPr>
-        <w:t xml:space="preserve">到中央汇总机的对应协议 </w:t>
+        <w:t xml:space="preserve"/>
       </w:r>
       <w:r>
         <w:rPr>
@@ -13449,7 +13449,7 @@
           <w:b/>
           <w:sz w:val="28"/>
         </w:rPr>
-        <w:t>namespace</w:t>
+        <w:t/>
       </w:r>
       <w:r>
         <w:rPr>
@@ -13457,7 +13457,7 @@
           <w:b/>
           <w:sz w:val="28"/>
         </w:rPr>
-        <w:t>，不得改名、覆盖或拼接单个记录。</w:t>
+        <w:t/>
       </w:r>
       <w:r>
         <w:rPr>
@@ -13473,7 +13473,7 @@
           <w:b/>
           <w:sz w:val="28"/>
         </w:rPr>
-        <w:t>聚合前必须通过兼容性门禁：</w:t>
+        <w:t/>
       </w:r>
       <w:r>
         <w:rPr>
@@ -13481,7 +13481,7 @@
           <w:b/>
           <w:sz w:val="28"/>
         </w:rPr>
-        <w:t>protocol_version</w:t>
+        <w:t/>
       </w:r>
       <w:r>
         <w:rPr>
@@ -13489,7 +13489,7 @@
           <w:b/>
           <w:sz w:val="28"/>
         </w:rPr>
-        <w:t>、</w:t>
+        <w:t/>
       </w:r>
       <w:r>
         <w:rPr>
@@ -13497,7 +13497,7 @@
           <w:b/>
           <w:sz w:val="28"/>
         </w:rPr>
-        <w:t>stage</w:t>
+        <w:t/>
       </w:r>
       <w:r>
         <w:rPr>
@@ -13505,7 +13505,7 @@
           <w:b/>
           <w:sz w:val="28"/>
         </w:rPr>
-        <w:t>、</w:t>
+        <w:t/>
       </w:r>
       <w:r>
         <w:rPr>
@@ -13513,7 +13513,7 @@
           <w:b/>
           <w:sz w:val="28"/>
         </w:rPr>
-        <w:t>experiment_id</w:t>
+        <w:t/>
       </w:r>
       <w:r>
         <w:rPr>
@@ -13521,7 +13521,7 @@
           <w:b/>
           <w:sz w:val="28"/>
         </w:rPr>
-        <w:t>、</w:t>
+        <w:t/>
       </w:r>
       <w:r>
         <w:rPr>
@@ -13529,7 +13529,7 @@
           <w:b/>
           <w:sz w:val="28"/>
         </w:rPr>
-        <w:t>manifest_hash</w:t>
+        <w:t/>
       </w:r>
       <w:r>
         <w:rPr>
@@ -13537,7 +13537,7 @@
           <w:b/>
           <w:sz w:val="28"/>
         </w:rPr>
-        <w:t>、</w:t>
+        <w:t/>
       </w:r>
       <w:r>
         <w:rPr>
@@ -13545,7 +13545,7 @@
           <w:b/>
           <w:sz w:val="28"/>
         </w:rPr>
-        <w:t>metrics_config_hash</w:t>
+        <w:t/>
       </w:r>
       <w:r>
         <w:rPr>
@@ -13553,7 +13553,7 @@
           <w:b/>
           <w:sz w:val="28"/>
         </w:rPr>
-        <w:t>、</w:t>
+        <w:t/>
       </w:r>
       <w:r>
         <w:rPr>
@@ -13561,7 +13561,7 @@
           <w:b/>
           <w:sz w:val="28"/>
         </w:rPr>
-        <w:t>physics_profile_hash</w:t>
+        <w:t/>
       </w:r>
       <w:r>
         <w:rPr>
@@ -13569,7 +13569,7 @@
           <w:b/>
           <w:sz w:val="28"/>
         </w:rPr>
-        <w:t>、</w:t>
+        <w:t/>
       </w:r>
       <w:r>
         <w:rPr>
@@ -13577,7 +13577,7 @@
           <w:b/>
           <w:sz w:val="28"/>
         </w:rPr>
-        <w:t>evaluation_code_commit</w:t>
+        <w:t/>
       </w:r>
       <w:r>
         <w:rPr>
@@ -13585,7 +13585,7 @@
           <w:b/>
           <w:sz w:val="28"/>
         </w:rPr>
-        <w:t>、</w:t>
+        <w:t/>
       </w:r>
       <w:r>
         <w:rPr>
@@ -13593,7 +13593,7 @@
           <w:b/>
           <w:sz w:val="28"/>
         </w:rPr>
-        <w:t xml:space="preserve">asset_hash </w:t>
+        <w:t xml:space="preserve"/>
       </w:r>
       <w:r>
         <w:rPr>
@@ -13601,7 +13601,7 @@
           <w:b/>
           <w:sz w:val="28"/>
         </w:rPr>
-        <w:t xml:space="preserve">和 </w:t>
+        <w:t xml:space="preserve"/>
       </w:r>
       <w:r>
         <w:rPr>
@@ -13609,7 +13609,7 @@
           <w:b/>
           <w:sz w:val="28"/>
         </w:rPr>
-        <w:t xml:space="preserve">simulator_version </w:t>
+        <w:t xml:space="preserve"/>
       </w:r>
       <w:r>
         <w:rPr>
@@ -13617,7 +13617,7 @@
           <w:b/>
           <w:sz w:val="28"/>
         </w:rPr>
-        <w:t xml:space="preserve">一致；每个模型必须匹配冻结 </w:t>
+        <w:t xml:space="preserve"/>
       </w:r>
       <w:r>
         <w:rPr>
@@ -13625,7 +13625,7 @@
           <w:b/>
           <w:sz w:val="28"/>
         </w:rPr>
-        <w:t>checkpoint hash</w:t>
+        <w:t/>
       </w:r>
       <w:r>
         <w:rPr>
@@ -13633,7 +13633,7 @@
           <w:b/>
           <w:sz w:val="28"/>
         </w:rPr>
-        <w:t xml:space="preserve">。随后检查 </w:t>
+        <w:t xml:space="preserve"/>
       </w:r>
       <w:r>
         <w:rPr>
@@ -13641,7 +13641,7 @@
           <w:b/>
           <w:sz w:val="28"/>
         </w:rPr>
-        <w:t xml:space="preserve">trial_id </w:t>
+        <w:t xml:space="preserve"/>
       </w:r>
       <w:r>
         <w:rPr>
@@ -13649,7 +13649,7 @@
           <w:b/>
           <w:sz w:val="28"/>
         </w:rPr>
-        <w:t xml:space="preserve">与 </w:t>
+        <w:t xml:space="preserve"/>
       </w:r>
       <w:r>
         <w:rPr>
@@ -13657,7 +13657,7 @@
           <w:b/>
           <w:sz w:val="28"/>
         </w:rPr>
-        <w:t xml:space="preserve">eval_seed </w:t>
+        <w:t xml:space="preserve"/>
       </w:r>
       <w:r>
         <w:rPr>
@@ -13665,7 +13665,7 @@
           <w:b/>
           <w:sz w:val="28"/>
         </w:rPr>
-        <w:t>唯一性、文件哈希、计划覆盖、分母闭合以及</w:t>
+        <w:t/>
       </w:r>
       <w:r>
         <w:rPr>
@@ -13673,7 +13673,7 @@
           <w:b/>
           <w:sz w:val="28"/>
         </w:rPr>
-        <w:t xml:space="preserve">EVAL_INVALID </w:t>
+        <w:t xml:space="preserve"/>
       </w:r>
       <w:r>
         <w:rPr>
@@ -13681,7 +13681,7 @@
           <w:b/>
           <w:sz w:val="28"/>
         </w:rPr>
-        <w:t>分类。任一冲突均停止合并并隔离复核，不得以保留结果更好的一份来解决冲突。</w:t>
+        <w:t/>
       </w:r>
       <w:r>
         <w:rPr>
@@ -13697,7 +13697,7 @@
           <w:b/>
           <w:sz w:val="28"/>
         </w:rPr>
-        <w:t xml:space="preserve">三服务器只是加速评测，不构成三个训练种子或三个统计重复。论文置信区间仍描述固定 </w:t>
+        <w:t xml:space="preserve"/>
       </w:r>
       <w:r>
         <w:rPr>
@@ -13705,7 +13705,7 @@
           <w:b/>
           <w:sz w:val="28"/>
         </w:rPr>
-        <w:t xml:space="preserve">checkpoint </w:t>
+        <w:t xml:space="preserve"/>
       </w:r>
       <w:r>
         <w:rPr>
@@ -13713,7 +13713,7 @@
           <w:b/>
           <w:sz w:val="28"/>
         </w:rPr>
-        <w:t xml:space="preserve">下独立评测条件的变异，不得表述为跨训练 </w:t>
+        <w:t xml:space="preserve"/>
       </w:r>
       <w:r>
         <w:rPr>
@@ -13721,7 +13721,7 @@
           <w:b/>
           <w:sz w:val="28"/>
         </w:rPr>
-        <w:t xml:space="preserve">seed </w:t>
+        <w:t xml:space="preserve"/>
       </w:r>
       <w:r>
         <w:rPr>
@@ -13729,7 +13729,7 @@
           <w:b/>
           <w:sz w:val="28"/>
         </w:rPr>
-        <w:t>稳定性。</w:t>
+        <w:t/>
       </w:r>
       <w:r>
         <w:rPr>
@@ -13746,7 +13746,7 @@
           <w:b/>
           <w:sz w:val="28"/>
         </w:rPr>
-        <w:t>参考依据</w:t>
+        <w:t/>
       </w:r>
     </w:p>
     <w:p>
@@ -13760,294 +13760,294 @@
           <w:rFonts w:eastAsia="Hiragino Sans GB"/>
           <w:sz w:val="21"/>
         </w:rPr>
-        <w:t>Lin et al. HWC Loco A Hierarchical Whole Body Control Approach to Robust Humanoid Locomotion 2025</w:t>
-      </w:r>
-      <w:r>
-        <w:rPr>
-          <w:rFonts w:ascii="Arial" w:hAnsi="Arial"/>
-          <w:sz w:val="21"/>
-        </w:rPr>
-        <w:t>。</w:t>
-      </w:r>
-      <w:r>
-        <w:rPr>
-          <w:rFonts w:eastAsia="Hiragino Sans GB"/>
-          <w:sz w:val="21"/>
-        </w:rPr>
-        <w:t xml:space="preserve">HWC Loco </w:t>
-      </w:r>
-      <w:r>
-        <w:rPr>
-          <w:rFonts w:ascii="Arial" w:hAnsi="Arial"/>
-          <w:sz w:val="21"/>
-        </w:rPr>
-        <w:t>采用三个随机训练种子、</w:t>
-      </w:r>
-      <w:r>
-        <w:rPr>
-          <w:rFonts w:eastAsia="Hiragino Sans GB"/>
-          <w:sz w:val="21"/>
-        </w:rPr>
-        <w:t xml:space="preserve">1000 </w:t>
-      </w:r>
-      <w:r>
-        <w:rPr>
-          <w:rFonts w:ascii="Arial" w:hAnsi="Arial"/>
-          <w:sz w:val="21"/>
-        </w:rPr>
-        <w:t xml:space="preserve">个评测环境和 </w:t>
-      </w:r>
-      <w:r>
-        <w:rPr>
-          <w:rFonts w:eastAsia="Hiragino Sans GB"/>
-          <w:sz w:val="21"/>
-        </w:rPr>
-        <w:t xml:space="preserve">12 s </w:t>
-      </w:r>
-      <w:r>
-        <w:rPr>
-          <w:rFonts w:ascii="Arial" w:hAnsi="Arial"/>
-          <w:sz w:val="21"/>
-        </w:rPr>
-        <w:t xml:space="preserve">正常行走评测，其控制频率为 </w:t>
-      </w:r>
-      <w:r>
-        <w:rPr>
-          <w:rFonts w:eastAsia="Hiragino Sans GB"/>
-          <w:sz w:val="21"/>
-        </w:rPr>
-        <w:t>100 Hz</w:t>
-      </w:r>
-      <w:r>
-        <w:rPr>
-          <w:rFonts w:ascii="Arial" w:hAnsi="Arial"/>
-          <w:sz w:val="21"/>
-        </w:rPr>
-        <w:t xml:space="preserve">，因此 </w:t>
-      </w:r>
-      <w:r>
-        <w:rPr>
-          <w:rFonts w:eastAsia="Hiragino Sans GB"/>
-          <w:sz w:val="21"/>
-        </w:rPr>
-        <w:t xml:space="preserve">1200 </w:t>
-      </w:r>
-      <w:r>
-        <w:rPr>
-          <w:rFonts w:ascii="Arial" w:hAnsi="Arial"/>
-          <w:sz w:val="21"/>
-        </w:rPr>
-        <w:t xml:space="preserve">步对应 </w:t>
-      </w:r>
-      <w:r>
-        <w:rPr>
-          <w:rFonts w:eastAsia="Hiragino Sans GB"/>
-          <w:sz w:val="21"/>
-        </w:rPr>
-        <w:t>12 s</w:t>
-      </w:r>
-      <w:r>
-        <w:rPr>
-          <w:rFonts w:ascii="Arial" w:hAnsi="Arial"/>
-          <w:sz w:val="21"/>
-        </w:rPr>
-        <w:t xml:space="preserve">。本文仅采用每种方法一个冻结 </w:t>
-      </w:r>
-      <w:r>
-        <w:rPr>
-          <w:rFonts w:eastAsia="Hiragino Sans GB"/>
-          <w:sz w:val="21"/>
-        </w:rPr>
-        <w:t>checkpoint</w:t>
-      </w:r>
-      <w:r>
-        <w:rPr>
-          <w:rFonts w:ascii="Arial" w:hAnsi="Arial"/>
-          <w:sz w:val="21"/>
-        </w:rPr>
-        <w:t xml:space="preserve">，不复现其训练种子重复；评测时使用大量独立 </w:t>
-      </w:r>
-      <w:r>
-        <w:rPr>
-          <w:rFonts w:eastAsia="Hiragino Sans GB"/>
-          <w:sz w:val="21"/>
-        </w:rPr>
-        <w:t>eval seed</w:t>
-      </w:r>
-      <w:r>
-        <w:rPr>
-          <w:rFonts w:ascii="Arial" w:hAnsi="Arial"/>
-          <w:sz w:val="21"/>
-        </w:rPr>
-        <w:t xml:space="preserve">。本文策略更新频率为 </w:t>
-      </w:r>
-      <w:r>
-        <w:rPr>
-          <w:rFonts w:eastAsia="Hiragino Sans GB"/>
-          <w:sz w:val="21"/>
-        </w:rPr>
-        <w:t>50 Hz</w:t>
-      </w:r>
-      <w:r>
-        <w:rPr>
-          <w:rFonts w:ascii="Arial" w:hAnsi="Arial"/>
-          <w:sz w:val="21"/>
-        </w:rPr>
-        <w:t xml:space="preserve">，同样的 </w:t>
-      </w:r>
-      <w:r>
-        <w:rPr>
-          <w:rFonts w:eastAsia="Hiragino Sans GB"/>
-          <w:sz w:val="21"/>
-        </w:rPr>
-        <w:t xml:space="preserve">12 s </w:t>
-      </w:r>
-      <w:r>
-        <w:rPr>
-          <w:rFonts w:ascii="Arial" w:hAnsi="Arial"/>
-          <w:sz w:val="21"/>
-        </w:rPr>
-        <w:t xml:space="preserve">对应 </w:t>
-      </w:r>
-      <w:r>
-        <w:rPr>
-          <w:rFonts w:eastAsia="Hiragino Sans GB"/>
-          <w:sz w:val="21"/>
-        </w:rPr>
-        <w:t xml:space="preserve">600 </w:t>
-      </w:r>
-      <w:r>
-        <w:rPr>
-          <w:rFonts w:ascii="Arial" w:hAnsi="Arial"/>
-          <w:sz w:val="21"/>
-        </w:rPr>
-        <w:t xml:space="preserve">个策略步。本文采用 </w:t>
-      </w:r>
-      <w:r>
-        <w:rPr>
-          <w:rFonts w:eastAsia="Hiragino Sans GB"/>
-          <w:sz w:val="21"/>
-        </w:rPr>
-        <w:t xml:space="preserve">HWC Loco </w:t>
-      </w:r>
-      <w:r>
-        <w:rPr>
-          <w:rFonts w:ascii="Arial" w:hAnsi="Arial"/>
-          <w:sz w:val="21"/>
-        </w:rPr>
-        <w:t xml:space="preserve">公开的 </w:t>
-      </w:r>
-      <w:r>
-        <w:rPr>
-          <w:rFonts w:eastAsia="Hiragino Sans GB"/>
-          <w:sz w:val="21"/>
-        </w:rPr>
-        <w:t xml:space="preserve">CoM </w:t>
-      </w:r>
-      <w:r>
-        <w:rPr>
-          <w:rFonts w:ascii="Arial" w:hAnsi="Arial"/>
-          <w:sz w:val="21"/>
-        </w:rPr>
-        <w:t xml:space="preserve">低高冲量幅值范围以及 </w:t>
-      </w:r>
-      <w:r>
-        <w:rPr>
-          <w:rFonts w:eastAsia="Hiragino Sans GB"/>
-          <w:sz w:val="21"/>
-        </w:rPr>
-        <w:t xml:space="preserve">1 Hz </w:t>
-      </w:r>
-      <w:r>
-        <w:rPr>
-          <w:rFonts w:ascii="Arial" w:hAnsi="Arial"/>
-          <w:sz w:val="21"/>
-        </w:rPr>
-        <w:t xml:space="preserve">低频扰动和 </w:t>
-      </w:r>
-      <w:r>
-        <w:rPr>
-          <w:rFonts w:eastAsia="Hiragino Sans GB"/>
-          <w:sz w:val="21"/>
-        </w:rPr>
-        <w:t xml:space="preserve">0.5 s </w:t>
-      </w:r>
-      <w:r>
-        <w:rPr>
-          <w:rFonts w:ascii="Arial" w:hAnsi="Arial"/>
-          <w:sz w:val="21"/>
-        </w:rPr>
-        <w:t>常值扰动形式；</w:t>
-      </w:r>
-      <w:r>
-        <w:rPr>
-          <w:rFonts w:eastAsia="Hiragino Sans GB"/>
-          <w:sz w:val="21"/>
-        </w:rPr>
-        <w:t xml:space="preserve">wrench </w:t>
-      </w:r>
-      <w:r>
-        <w:rPr>
-          <w:rFonts w:ascii="Arial" w:hAnsi="Arial"/>
-          <w:sz w:val="21"/>
-        </w:rPr>
-        <w:t xml:space="preserve">上限由原文 </w:t>
-      </w:r>
-      <w:r>
-        <w:rPr>
-          <w:rFonts w:eastAsia="Hiragino Sans GB"/>
-          <w:sz w:val="21"/>
-        </w:rPr>
-        <w:t xml:space="preserve">200 N </w:t>
-      </w:r>
-      <w:r>
-        <w:rPr>
-          <w:rFonts w:ascii="Arial" w:hAnsi="Arial"/>
-          <w:sz w:val="21"/>
-        </w:rPr>
-        <w:t xml:space="preserve">和 </w:t>
-      </w:r>
-      <w:r>
-        <w:rPr>
-          <w:rFonts w:eastAsia="Hiragino Sans GB"/>
-          <w:sz w:val="21"/>
-        </w:rPr>
-        <w:t>200 N·m</w:t>
-      </w:r>
-      <w:r>
-        <w:rPr>
-          <w:rFonts w:ascii="Arial" w:hAnsi="Arial"/>
-          <w:sz w:val="21"/>
-        </w:rPr>
-        <w:t xml:space="preserve">调整为本文的 </w:t>
-      </w:r>
-      <w:r>
-        <w:rPr>
-          <w:rFonts w:eastAsia="Hiragino Sans GB"/>
-          <w:sz w:val="21"/>
-        </w:rPr>
-        <w:t xml:space="preserve">150 N </w:t>
-      </w:r>
-      <w:r>
-        <w:rPr>
-          <w:rFonts w:ascii="Arial" w:hAnsi="Arial"/>
-          <w:sz w:val="21"/>
-        </w:rPr>
-        <w:t xml:space="preserve">和 </w:t>
-      </w:r>
-      <w:r>
-        <w:rPr>
-          <w:rFonts w:eastAsia="Hiragino Sans GB"/>
-          <w:sz w:val="21"/>
-        </w:rPr>
-        <w:t>150 N·m</w:t>
-      </w:r>
-      <w:r>
-        <w:rPr>
-          <w:rFonts w:ascii="Arial" w:hAnsi="Arial"/>
-          <w:sz w:val="21"/>
-        </w:rPr>
-        <w:t>。</w:t>
+        <w:t xml:space="preserve">参考依据：Lin et al. HWC Loco A Hierarchical Whole Body Control Approach to Robust Humanoid Locomotion 2025。HWC Loco 采用三个随机训练种子、1000 个评测环境和 12 s 正常行走评测。本文允许用户评测多个 checkpoint，但每个 checkpoint SHA 作为独立变体保存；只有显式设计为独立训练 seed 的结果才可用于训练随机性分析。本文策略更新频率为 50 Hz，12 s 对应 600 个策略步，并采用配对 eval seed 保证变体间公平比较。</w:t>
+      </w:r>
+      <w:r>
+        <w:rPr>
+          <w:rFonts w:ascii="Arial" w:hAnsi="Arial"/>
+          <w:sz w:val="21"/>
+        </w:rPr>
+        <w:t/>
+      </w:r>
+      <w:r>
+        <w:rPr>
+          <w:rFonts w:eastAsia="Hiragino Sans GB"/>
+          <w:sz w:val="21"/>
+        </w:rPr>
+        <w:t xml:space="preserve"/>
+      </w:r>
+      <w:r>
+        <w:rPr>
+          <w:rFonts w:ascii="Arial" w:hAnsi="Arial"/>
+          <w:sz w:val="21"/>
+        </w:rPr>
+        <w:t/>
+      </w:r>
+      <w:r>
+        <w:rPr>
+          <w:rFonts w:eastAsia="Hiragino Sans GB"/>
+          <w:sz w:val="21"/>
+        </w:rPr>
+        <w:t xml:space="preserve"/>
+      </w:r>
+      <w:r>
+        <w:rPr>
+          <w:rFonts w:ascii="Arial" w:hAnsi="Arial"/>
+          <w:sz w:val="21"/>
+        </w:rPr>
+        <w:t xml:space="preserve"/>
+      </w:r>
+      <w:r>
+        <w:rPr>
+          <w:rFonts w:eastAsia="Hiragino Sans GB"/>
+          <w:sz w:val="21"/>
+        </w:rPr>
+        <w:t xml:space="preserve"/>
+      </w:r>
+      <w:r>
+        <w:rPr>
+          <w:rFonts w:ascii="Arial" w:hAnsi="Arial"/>
+          <w:sz w:val="21"/>
+        </w:rPr>
+        <w:t xml:space="preserve"/>
+      </w:r>
+      <w:r>
+        <w:rPr>
+          <w:rFonts w:eastAsia="Hiragino Sans GB"/>
+          <w:sz w:val="21"/>
+        </w:rPr>
+        <w:t/>
+      </w:r>
+      <w:r>
+        <w:rPr>
+          <w:rFonts w:ascii="Arial" w:hAnsi="Arial"/>
+          <w:sz w:val="21"/>
+        </w:rPr>
+        <w:t xml:space="preserve"/>
+      </w:r>
+      <w:r>
+        <w:rPr>
+          <w:rFonts w:eastAsia="Hiragino Sans GB"/>
+          <w:sz w:val="21"/>
+        </w:rPr>
+        <w:t xml:space="preserve"/>
+      </w:r>
+      <w:r>
+        <w:rPr>
+          <w:rFonts w:ascii="Arial" w:hAnsi="Arial"/>
+          <w:sz w:val="21"/>
+        </w:rPr>
+        <w:t xml:space="preserve"/>
+      </w:r>
+      <w:r>
+        <w:rPr>
+          <w:rFonts w:eastAsia="Hiragino Sans GB"/>
+          <w:sz w:val="21"/>
+        </w:rPr>
+        <w:t/>
+      </w:r>
+      <w:r>
+        <w:rPr>
+          <w:rFonts w:ascii="Arial" w:hAnsi="Arial"/>
+          <w:sz w:val="21"/>
+        </w:rPr>
+        <w:t xml:space="preserve"/>
+      </w:r>
+      <w:r>
+        <w:rPr>
+          <w:rFonts w:eastAsia="Hiragino Sans GB"/>
+          <w:sz w:val="21"/>
+        </w:rPr>
+        <w:t/>
+      </w:r>
+      <w:r>
+        <w:rPr>
+          <w:rFonts w:ascii="Arial" w:hAnsi="Arial"/>
+          <w:sz w:val="21"/>
+        </w:rPr>
+        <w:t xml:space="preserve"/>
+      </w:r>
+      <w:r>
+        <w:rPr>
+          <w:rFonts w:eastAsia="Hiragino Sans GB"/>
+          <w:sz w:val="21"/>
+        </w:rPr>
+        <w:t/>
+      </w:r>
+      <w:r>
+        <w:rPr>
+          <w:rFonts w:ascii="Arial" w:hAnsi="Arial"/>
+          <w:sz w:val="21"/>
+        </w:rPr>
+        <w:t xml:space="preserve"/>
+      </w:r>
+      <w:r>
+        <w:rPr>
+          <w:rFonts w:eastAsia="Hiragino Sans GB"/>
+          <w:sz w:val="21"/>
+        </w:rPr>
+        <w:t/>
+      </w:r>
+      <w:r>
+        <w:rPr>
+          <w:rFonts w:ascii="Arial" w:hAnsi="Arial"/>
+          <w:sz w:val="21"/>
+        </w:rPr>
+        <w:t xml:space="preserve"/>
+      </w:r>
+      <w:r>
+        <w:rPr>
+          <w:rFonts w:eastAsia="Hiragino Sans GB"/>
+          <w:sz w:val="21"/>
+        </w:rPr>
+        <w:t xml:space="preserve"/>
+      </w:r>
+      <w:r>
+        <w:rPr>
+          <w:rFonts w:ascii="Arial" w:hAnsi="Arial"/>
+          <w:sz w:val="21"/>
+        </w:rPr>
+        <w:t xml:space="preserve"/>
+      </w:r>
+      <w:r>
+        <w:rPr>
+          <w:rFonts w:eastAsia="Hiragino Sans GB"/>
+          <w:sz w:val="21"/>
+        </w:rPr>
+        <w:t xml:space="preserve"/>
+      </w:r>
+      <w:r>
+        <w:rPr>
+          <w:rFonts w:ascii="Arial" w:hAnsi="Arial"/>
+          <w:sz w:val="21"/>
+        </w:rPr>
+        <w:t xml:space="preserve"/>
+      </w:r>
+      <w:r>
+        <w:rPr>
+          <w:rFonts w:eastAsia="Hiragino Sans GB"/>
+          <w:sz w:val="21"/>
+        </w:rPr>
+        <w:t xml:space="preserve"/>
+      </w:r>
+      <w:r>
+        <w:rPr>
+          <w:rFonts w:ascii="Arial" w:hAnsi="Arial"/>
+          <w:sz w:val="21"/>
+        </w:rPr>
+        <w:t xml:space="preserve"/>
+      </w:r>
+      <w:r>
+        <w:rPr>
+          <w:rFonts w:eastAsia="Hiragino Sans GB"/>
+          <w:sz w:val="21"/>
+        </w:rPr>
+        <w:t xml:space="preserve"/>
+      </w:r>
+      <w:r>
+        <w:rPr>
+          <w:rFonts w:ascii="Arial" w:hAnsi="Arial"/>
+          <w:sz w:val="21"/>
+        </w:rPr>
+        <w:t xml:space="preserve"/>
+      </w:r>
+      <w:r>
+        <w:rPr>
+          <w:rFonts w:eastAsia="Hiragino Sans GB"/>
+          <w:sz w:val="21"/>
+        </w:rPr>
+        <w:t xml:space="preserve"/>
+      </w:r>
+      <w:r>
+        <w:rPr>
+          <w:rFonts w:ascii="Arial" w:hAnsi="Arial"/>
+          <w:sz w:val="21"/>
+        </w:rPr>
+        <w:t xml:space="preserve"/>
+      </w:r>
+      <w:r>
+        <w:rPr>
+          <w:rFonts w:eastAsia="Hiragino Sans GB"/>
+          <w:sz w:val="21"/>
+        </w:rPr>
+        <w:t xml:space="preserve"/>
+      </w:r>
+      <w:r>
+        <w:rPr>
+          <w:rFonts w:ascii="Arial" w:hAnsi="Arial"/>
+          <w:sz w:val="21"/>
+        </w:rPr>
+        <w:t/>
+      </w:r>
+      <w:r>
+        <w:rPr>
+          <w:rFonts w:eastAsia="Hiragino Sans GB"/>
+          <w:sz w:val="21"/>
+        </w:rPr>
+        <w:t xml:space="preserve"/>
+      </w:r>
+      <w:r>
+        <w:rPr>
+          <w:rFonts w:ascii="Arial" w:hAnsi="Arial"/>
+          <w:sz w:val="21"/>
+        </w:rPr>
+        <w:t xml:space="preserve"/>
+      </w:r>
+      <w:r>
+        <w:rPr>
+          <w:rFonts w:eastAsia="Hiragino Sans GB"/>
+          <w:sz w:val="21"/>
+        </w:rPr>
+        <w:t xml:space="preserve"/>
+      </w:r>
+      <w:r>
+        <w:rPr>
+          <w:rFonts w:ascii="Arial" w:hAnsi="Arial"/>
+          <w:sz w:val="21"/>
+        </w:rPr>
+        <w:t xml:space="preserve"/>
+      </w:r>
+      <w:r>
+        <w:rPr>
+          <w:rFonts w:eastAsia="Hiragino Sans GB"/>
+          <w:sz w:val="21"/>
+        </w:rPr>
+        <w:t/>
+      </w:r>
+      <w:r>
+        <w:rPr>
+          <w:rFonts w:ascii="Arial" w:hAnsi="Arial"/>
+          <w:sz w:val="21"/>
+        </w:rPr>
+        <w:t xml:space="preserve"/>
+      </w:r>
+      <w:r>
+        <w:rPr>
+          <w:rFonts w:eastAsia="Hiragino Sans GB"/>
+          <w:sz w:val="21"/>
+        </w:rPr>
+        <w:t xml:space="preserve"/>
+      </w:r>
+      <w:r>
+        <w:rPr>
+          <w:rFonts w:ascii="Arial" w:hAnsi="Arial"/>
+          <w:sz w:val="21"/>
+        </w:rPr>
+        <w:t xml:space="preserve"/>
+      </w:r>
+      <w:r>
+        <w:rPr>
+          <w:rFonts w:eastAsia="Hiragino Sans GB"/>
+          <w:sz w:val="21"/>
+        </w:rPr>
+        <w:t/>
+      </w:r>
+      <w:r>
+        <w:rPr>
+          <w:rFonts w:ascii="Arial" w:hAnsi="Arial"/>
+          <w:sz w:val="21"/>
+        </w:rPr>
+        <w:t/>
       </w:r>
     </w:p>
     <w:p>
@@ -14065,7 +14065,7 @@
       </w:r>
     </w:p>
     <w:sectPr>
-      <w:footerReference w:type="default" r:id="rId2"/>
+      <w:footerReference w:type="default" ns2:id="rId2"/>
       <w:type w:val="nextPage"/>
       <w:pgSz w:w="11906" w:h="16838"/>
       <w:pgMar w:left="1134" w:right="1134" w:gutter="0" w:header="0" w:top="1020" w:footer="720" w:bottom="964"/>

</xml_diff>